<commit_message>
Added photo, purchase link, and toy_info for Amazon Climbing Ducks
</commit_message>
<xml_diff>
--- a/Toy_Instructions/Sound_Movement_Light/Amazon_Climbing_Ducks/Amazon_Climbing_Ducks_Maker_Guide.docx
+++ b/Toy_Instructions/Sound_Movement_Light/Amazon_Climbing_Ducks/Amazon_Climbing_Ducks_Maker_Guide.docx
@@ -1,6 +1,6 @@
 
 <file path=word/document.xml><?xml version="1.0" encoding="utf-8"?>
-<w:document xmlns:wpc="http://schemas.microsoft.com/office/word/2010/wordprocessingCanvas" xmlns:cx="http://schemas.microsoft.com/office/drawing/2014/chartex" xmlns:cx1="http://schemas.microsoft.com/office/drawing/2015/9/8/chartex" xmlns:cx2="http://schemas.microsoft.com/office/drawing/2015/10/21/chartex" xmlns:cx3="http://schemas.microsoft.com/office/drawing/2016/5/9/chartex" xmlns:cx4="http://schemas.microsoft.com/office/drawing/2016/5/10/chartex" xmlns:cx5="http://schemas.microsoft.com/office/drawing/2016/5/11/chartex" xmlns:cx6="http://schemas.microsoft.com/office/drawing/2016/5/12/chartex" xmlns:cx7="http://schemas.microsoft.com/office/drawing/2016/5/13/chartex" xmlns:cx8="http://schemas.microsoft.com/office/drawing/2016/5/14/chartex" xmlns:mc="http://schemas.openxmlformats.org/markup-compatibility/2006" xmlns:aink="http://schemas.microsoft.com/office/drawing/2016/ink" xmlns:am3d="http://schemas.microsoft.com/office/drawing/2017/model3d" xmlns:o="urn:schemas-microsoft-com:office:office" xmlns:oel="http://schemas.microsoft.com/office/2019/extlst" xmlns:r="http://schemas.openxmlformats.org/officeDocument/2006/relationships" xmlns:m="http://schemas.openxmlformats.org/officeDocument/2006/math" xmlns:v="urn:schemas-microsoft-com:vml" xmlns:wp14="http://schemas.microsoft.com/office/word/2010/wordprocessingDrawing" xmlns:wp="http://schemas.openxmlformats.org/drawingml/2006/wordprocessingDrawing" xmlns:w10="urn:schemas-microsoft-com:office:word" xmlns:w="http://schemas.openxmlformats.org/wordprocessingml/2006/main" xmlns:w14="http://schemas.microsoft.com/office/word/2010/wordml" xmlns:w15="http://schemas.microsoft.com/office/word/2012/wordml" xmlns:w16cex="http://schemas.microsoft.com/office/word/2018/wordml/cex" xmlns:w16cid="http://schemas.microsoft.com/office/word/2016/wordml/cid" xmlns:w16="http://schemas.microsoft.com/office/word/2018/wordml" xmlns:w16du="http://schemas.microsoft.com/office/word/2023/wordml/word16du" xmlns:w16sdtdh="http://schemas.microsoft.com/office/word/2020/wordml/sdtdatahash" xmlns:w16sdtfl="http://schemas.microsoft.com/office/word/2024/wordml/sdtformatlock" xmlns:w16se="http://schemas.microsoft.com/office/word/2015/wordml/symex" xmlns:wpg="http://schemas.microsoft.com/office/word/2010/wordprocessingGroup" xmlns:wpi="http://schemas.microsoft.com/office/word/2010/wordprocessingInk" xmlns:wne="http://schemas.microsoft.com/office/word/2006/wordml" xmlns:wps="http://schemas.microsoft.com/office/word/2010/wordprocessingShape" mc:Ignorable="w14 w15 w16se w16cid w16 w16cex w16sdtdh w16sdtfl w16du wp14">
+<w:document xmlns:wpc="http://schemas.microsoft.com/office/word/2010/wordprocessingCanvas" xmlns:cx="http://schemas.microsoft.com/office/drawing/2014/chartex" xmlns:cx1="http://schemas.microsoft.com/office/drawing/2015/9/8/chartex" xmlns:cx2="http://schemas.microsoft.com/office/drawing/2015/10/21/chartex" xmlns:cx3="http://schemas.microsoft.com/office/drawing/2016/5/9/chartex" xmlns:cx4="http://schemas.microsoft.com/office/drawing/2016/5/10/chartex" xmlns:cx5="http://schemas.microsoft.com/office/drawing/2016/5/11/chartex" xmlns:cx6="http://schemas.microsoft.com/office/drawing/2016/5/12/chartex" xmlns:cx7="http://schemas.microsoft.com/office/drawing/2016/5/13/chartex" xmlns:cx8="http://schemas.microsoft.com/office/drawing/2016/5/14/chartex" xmlns:mc="http://schemas.openxmlformats.org/markup-compatibility/2006" xmlns:aink="http://schemas.microsoft.com/office/drawing/2016/ink" xmlns:am3d="http://schemas.microsoft.com/office/drawing/2017/model3d" xmlns:o="urn:schemas-microsoft-com:office:office" xmlns:oel="http://schemas.microsoft.com/office/2019/extlst" xmlns:r="http://schemas.openxmlformats.org/officeDocument/2006/relationships" xmlns:m="http://schemas.openxmlformats.org/officeDocument/2006/math" xmlns:v="urn:schemas-microsoft-com:vml" xmlns:wp14="http://schemas.microsoft.com/office/word/2010/wordprocessingDrawing" xmlns:wp="http://schemas.openxmlformats.org/drawingml/2006/wordprocessingDrawing" xmlns:w10="urn:schemas-microsoft-com:office:word" xmlns:w="http://schemas.openxmlformats.org/wordprocessingml/2006/main" xmlns:w14="http://schemas.microsoft.com/office/word/2010/wordml" xmlns:w15="http://schemas.microsoft.com/office/word/2012/wordml" xmlns:w16cei="http://schemas.microsoft.com/office/word/2026/wordml/cei" xmlns:w16cex="http://schemas.microsoft.com/office/word/2018/wordml/cex" xmlns:w16cid="http://schemas.microsoft.com/office/word/2016/wordml/cid" xmlns:w16="http://schemas.microsoft.com/office/word/2018/wordml" xmlns:w16du="http://schemas.microsoft.com/office/word/2023/wordml/word16du" xmlns:w16sdtdh="http://schemas.microsoft.com/office/word/2020/wordml/sdtdatahash" xmlns:w16sdtfl="http://schemas.microsoft.com/office/word/2024/wordml/sdtformatlock" xmlns:w16se="http://schemas.microsoft.com/office/word/2015/wordml/symex" xmlns:wpg="http://schemas.microsoft.com/office/word/2010/wordprocessingGroup" xmlns:wpi="http://schemas.microsoft.com/office/word/2010/wordprocessingInk" xmlns:wne="http://schemas.microsoft.com/office/word/2006/wordml" xmlns:wps="http://schemas.microsoft.com/office/word/2010/wordprocessingShape" mc:Ignorable="w14 w15 w16se w16cid w16 w16cex w16sdtdh w16sdtfl w16du wp14">
   <w:body>
     <w:p>
       <w:pPr>
@@ -210,12 +210,29 @@
                 <w:szCs w:val="24"/>
               </w:rPr>
             </w:pPr>
-            <w:r>
-              <w:rPr>
-                <w:sz w:val="24"/>
-                <w:szCs w:val="24"/>
-              </w:rPr>
-              <w:t>Amazon LED Electric Duck Climbing Stairs Toy</w:t>
+            <w:hyperlink r:id="rId13" w:history="1">
+              <w:r>
+                <w:rPr>
+                  <w:rStyle w:val="Hyperlink"/>
+                  <w:sz w:val="24"/>
+                  <w:szCs w:val="24"/>
+                </w:rPr>
+                <w:t>Amazon</w:t>
+              </w:r>
+            </w:hyperlink>
+            <w:r>
+              <w:rPr>
+                <w:sz w:val="24"/>
+                <w:szCs w:val="24"/>
+              </w:rPr>
+              <w:t xml:space="preserve"> LED Electric Duck Climbing Stairs Toy</w:t>
+            </w:r>
+            <w:r>
+              <w:rPr>
+                <w:sz w:val="24"/>
+                <w:szCs w:val="24"/>
+              </w:rPr>
+              <w:t xml:space="preserve"> </w:t>
             </w:r>
           </w:p>
           <w:p>
@@ -303,7 +320,7 @@
             <w:r>
               <w:t xml:space="preserve">Refer to the </w:t>
             </w:r>
-            <w:hyperlink r:id="rId13" w:history="1">
+            <w:hyperlink r:id="rId14" w:history="1">
               <w:r>
                 <w:rPr>
                   <w:rStyle w:val="Hyperlink"/>
@@ -385,7 +402,7 @@
                           <pic:cNvPicPr/>
                         </pic:nvPicPr>
                         <pic:blipFill rotWithShape="1">
-                          <a:blip r:embed="rId14">
+                          <a:blip r:embed="rId15">
                             <a:extLst>
                               <a:ext uri="{28A0092B-C50C-407E-A947-70E740481C1C}">
                                 <a14:useLocalDpi xmlns:a14="http://schemas.microsoft.com/office/drawing/2010/main" val="0"/>
@@ -473,7 +490,7 @@
                           </pic:cNvPicPr>
                         </pic:nvPicPr>
                         <pic:blipFill rotWithShape="1">
-                          <a:blip r:embed="rId15" cstate="print">
+                          <a:blip r:embed="rId16" cstate="print">
                             <a:extLst>
                               <a:ext uri="{28A0092B-C50C-407E-A947-70E740481C1C}">
                                 <a14:useLocalDpi xmlns:a14="http://schemas.microsoft.com/office/drawing/2010/main" val="0"/>
@@ -543,7 +560,7 @@
                           </pic:cNvPicPr>
                         </pic:nvPicPr>
                         <pic:blipFill rotWithShape="1">
-                          <a:blip r:embed="rId15" cstate="print">
+                          <a:blip r:embed="rId16" cstate="print">
                             <a:extLst>
                               <a:ext uri="{28A0092B-C50C-407E-A947-70E740481C1C}">
                                 <a14:useLocalDpi xmlns:a14="http://schemas.microsoft.com/office/drawing/2010/main" val="0"/>
@@ -758,21 +775,10 @@
     <w:p/>
     <w:p>
       <w:pPr>
-        <w:rPr>
-          <w:rFonts w:asciiTheme="majorHAnsi" w:eastAsiaTheme="majorEastAsia" w:hAnsiTheme="majorHAnsi" w:cstheme="majorBidi"/>
-          <w:b/>
-          <w:color w:val="767171" w:themeColor="background2" w:themeShade="80"/>
-          <w:sz w:val="40"/>
-          <w:szCs w:val="32"/>
-          <w:lang w:val="en-US"/>
-        </w:rPr>
-      </w:pPr>
-    </w:p>
-    <w:p>
-      <w:pPr>
         <w:pStyle w:val="Heading1"/>
       </w:pPr>
       <w:r>
+        <w:lastRenderedPageBreak/>
         <w:t>Assembly Instructions</w:t>
       </w:r>
     </w:p>
@@ -1375,7 +1381,7 @@
                           <pic:cNvPicPr/>
                         </pic:nvPicPr>
                         <pic:blipFill>
-                          <a:blip r:embed="rId16" cstate="print">
+                          <a:blip r:embed="rId17" cstate="print">
                             <a:extLst>
                               <a:ext uri="{28A0092B-C50C-407E-A947-70E740481C1C}">
                                 <a14:useLocalDpi xmlns:a14="http://schemas.microsoft.com/office/drawing/2010/main" val="0"/>
@@ -1654,7 +1660,6 @@
         <w:pStyle w:val="Heading2"/>
       </w:pPr>
       <w:r>
-        <w:lastRenderedPageBreak/>
         <w:t xml:space="preserve">Step </w:t>
       </w:r>
       <w:r>
@@ -1701,7 +1706,7 @@
                           <pic:cNvPicPr/>
                         </pic:nvPicPr>
                         <pic:blipFill>
-                          <a:blip r:embed="rId17" cstate="print">
+                          <a:blip r:embed="rId18" cstate="print">
                             <a:extLst>
                               <a:ext uri="{28A0092B-C50C-407E-A947-70E740481C1C}">
                                 <a14:useLocalDpi xmlns:a14="http://schemas.microsoft.com/office/drawing/2010/main" val="0"/>
@@ -1874,6 +1879,7 @@
       <w:bookmarkStart w:id="2" w:name="_Hlk115641000"/>
       <w:bookmarkStart w:id="3" w:name="_Hlk115691002"/>
       <w:r>
+        <w:lastRenderedPageBreak/>
         <w:t xml:space="preserve">Step </w:t>
       </w:r>
       <w:r>
@@ -1897,7 +1903,7 @@
       </w:tblGrid>
       <w:tr>
         <w:trPr>
-          <w:trHeight w:val="4978"/>
+          <w:trHeight w:val="4896"/>
         </w:trPr>
         <w:tc>
           <w:tcPr>
@@ -2066,7 +2072,7 @@
                 <w:noProof/>
               </w:rPr>
               <w:drawing>
-                <wp:inline distT="0" distB="0" distL="0" distR="0" wp14:anchorId="348EE850" wp14:editId="356181AC">
+                <wp:inline distT="0" distB="0" distL="0" distR="0" wp14:anchorId="348EE850" wp14:editId="1C28EE17">
                   <wp:extent cx="2286000" cy="3049200"/>
                   <wp:effectExtent l="0" t="0" r="0" b="0"/>
                   <wp:docPr id="8" name="Picture 8"/>
@@ -2083,7 +2089,7 @@
                           </pic:cNvPicPr>
                         </pic:nvPicPr>
                         <pic:blipFill>
-                          <a:blip r:embed="rId18" cstate="print">
+                          <a:blip r:embed="rId19" cstate="print">
                             <a:extLst>
                               <a:ext uri="{28A0092B-C50C-407E-A947-70E740481C1C}">
                                 <a14:useLocalDpi xmlns:a14="http://schemas.microsoft.com/office/drawing/2010/main" val="0"/>
@@ -2128,15 +2134,6 @@
                 <w:szCs w:val="24"/>
               </w:rPr>
             </w:pPr>
-          </w:p>
-          <w:p>
-            <w:pPr>
-              <w:spacing w:after="160" w:line="259" w:lineRule="auto"/>
-              <w:rPr>
-                <w:sz w:val="24"/>
-                <w:szCs w:val="24"/>
-              </w:rPr>
-            </w:pPr>
             <w:proofErr w:type="gramStart"/>
             <w:r>
               <w:rPr>
@@ -2270,7 +2267,6 @@
           </w:tcPr>
           <w:p>
             <w:pPr>
-              <w:pStyle w:val="ListParagraph"/>
               <w:spacing w:after="160" w:line="259" w:lineRule="auto"/>
             </w:pPr>
             <w:r>
@@ -2278,15 +2274,15 @@
                 <w:noProof/>
               </w:rPr>
               <w:drawing>
-                <wp:anchor distT="0" distB="0" distL="114300" distR="114300" simplePos="0" relativeHeight="251658240" behindDoc="0" locked="0" layoutInCell="1" allowOverlap="1" wp14:anchorId="40399F9A" wp14:editId="38EE9F49">
+                <wp:anchor distT="0" distB="0" distL="114300" distR="114300" simplePos="0" relativeHeight="251658240" behindDoc="0" locked="0" layoutInCell="1" allowOverlap="1" wp14:anchorId="40399F9A" wp14:editId="15132C14">
                   <wp:simplePos x="0" y="0"/>
                   <wp:positionH relativeFrom="column">
-                    <wp:posOffset>-65405</wp:posOffset>
+                    <wp:posOffset>-65083</wp:posOffset>
                   </wp:positionH>
                   <wp:positionV relativeFrom="paragraph">
-                    <wp:posOffset>73660</wp:posOffset>
+                    <wp:posOffset>77054</wp:posOffset>
                   </wp:positionV>
-                  <wp:extent cx="2289175" cy="3048635"/>
+                  <wp:extent cx="2063987" cy="2748738"/>
                   <wp:effectExtent l="0" t="0" r="0" b="0"/>
                   <wp:wrapTopAndBottom/>
                   <wp:docPr id="17" name="Picture 17"/>
@@ -2303,7 +2299,7 @@
                           </pic:cNvPicPr>
                         </pic:nvPicPr>
                         <pic:blipFill>
-                          <a:blip r:embed="rId19" cstate="print">
+                          <a:blip r:embed="rId20" cstate="print">
                             <a:extLst>
                               <a:ext uri="{28A0092B-C50C-407E-A947-70E740481C1C}">
                                 <a14:useLocalDpi xmlns:a14="http://schemas.microsoft.com/office/drawing/2010/main" val="0"/>
@@ -2318,7 +2314,7 @@
                         <pic:spPr bwMode="auto">
                           <a:xfrm>
                             <a:off x="0" y="0"/>
-                            <a:ext cx="2289175" cy="3048635"/>
+                            <a:ext cx="2067047" cy="2752813"/>
                           </a:xfrm>
                           <a:prstGeom prst="rect">
                             <a:avLst/>
@@ -2347,7 +2343,7 @@
               <mc:AlternateContent>
                 <mc:Choice Requires="wps">
                   <w:drawing>
-                    <wp:anchor distT="0" distB="0" distL="114300" distR="114300" simplePos="0" relativeHeight="251676672" behindDoc="0" locked="0" layoutInCell="1" allowOverlap="1" wp14:anchorId="0264AE8B" wp14:editId="2C51F9EA">
+                    <wp:anchor distT="0" distB="0" distL="114300" distR="114300" simplePos="0" relativeHeight="251676672" behindDoc="0" locked="0" layoutInCell="1" allowOverlap="1" wp14:anchorId="0264AE8B" wp14:editId="36988AD7">
                       <wp:simplePos x="0" y="0"/>
                       <wp:positionH relativeFrom="column">
                         <wp:posOffset>1045210</wp:posOffset>
@@ -2356,7 +2352,7 @@
                         <wp:posOffset>1259205</wp:posOffset>
                       </wp:positionV>
                       <wp:extent cx="273050" cy="146050"/>
-                      <wp:effectExtent l="0" t="38100" r="50800" b="25400"/>
+                      <wp:effectExtent l="19050" t="38100" r="50800" b="25400"/>
                       <wp:wrapNone/>
                       <wp:docPr id="40" name="Straight Arrow Connector 40"/>
                       <wp:cNvGraphicFramePr/>
@@ -2372,7 +2368,7 @@
                               <a:prstGeom prst="straightConnector1">
                                 <a:avLst/>
                               </a:prstGeom>
-                              <a:ln>
+                              <a:ln w="38100">
                                 <a:tailEnd type="triangle"/>
                               </a:ln>
                             </wps:spPr>
@@ -2399,7 +2395,11 @@
                 </mc:Choice>
                 <mc:Fallback>
                   <w:pict>
-                    <v:shape w14:anchorId="3AB5C25A" id="Straight Arrow Connector 40" o:spid="_x0000_s1026" type="#_x0000_t32" style="position:absolute;margin-left:82.3pt;margin-top:99.15pt;width:21.5pt;height:11.5pt;flip:y;z-index:251676672;visibility:visible;mso-wrap-style:square;mso-wrap-distance-left:9pt;mso-wrap-distance-top:0;mso-wrap-distance-right:9pt;mso-wrap-distance-bottom:0;mso-position-horizontal:absolute;mso-position-horizontal-relative:text;mso-position-vertical:absolute;mso-position-vertical-relative:text" o:gfxdata="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" strokecolor="#ef373e [3205]" strokeweight=".5pt">
+                    <v:shapetype w14:anchorId="10E2EFEE" id="_x0000_t32" coordsize="21600,21600" o:spt="32" o:oned="t" path="m,l21600,21600e" filled="f">
+                      <v:path arrowok="t" fillok="f" o:connecttype="none"/>
+                      <o:lock v:ext="edit" shapetype="t"/>
+                    </v:shapetype>
+                    <v:shape id="Straight Arrow Connector 40" o:spid="_x0000_s1026" type="#_x0000_t32" style="position:absolute;margin-left:82.3pt;margin-top:99.15pt;width:21.5pt;height:11.5pt;flip:y;z-index:251676672;visibility:visible;mso-wrap-style:square;mso-wrap-distance-left:9pt;mso-wrap-distance-top:0;mso-wrap-distance-right:9pt;mso-wrap-distance-bottom:0;mso-position-horizontal:absolute;mso-position-horizontal-relative:text;mso-position-vertical:absolute;mso-position-vertical-relative:text" o:gfxdata="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" strokecolor="#ef373e [3205]" strokeweight="3pt">
                       <v:stroke endarrow="block" joinstyle="miter"/>
                     </v:shape>
                   </w:pict>
@@ -2417,7 +2417,6 @@
         <w:pStyle w:val="Heading2"/>
       </w:pPr>
       <w:r>
-        <w:lastRenderedPageBreak/>
         <w:t xml:space="preserve">Step </w:t>
       </w:r>
       <w:r>
@@ -2688,7 +2687,7 @@
                 <w:noProof/>
               </w:rPr>
               <w:drawing>
-                <wp:inline distT="0" distB="0" distL="0" distR="0" wp14:anchorId="56C96ACA" wp14:editId="0B04243B">
+                <wp:inline distT="0" distB="0" distL="0" distR="0" wp14:anchorId="56C96ACA" wp14:editId="16412653">
                   <wp:extent cx="3049200" cy="2286000"/>
                   <wp:effectExtent l="0" t="0" r="0" b="0"/>
                   <wp:docPr id="10" name="Picture 10"/>
@@ -2705,7 +2704,7 @@
                           </pic:cNvPicPr>
                         </pic:nvPicPr>
                         <pic:blipFill>
-                          <a:blip r:embed="rId20" cstate="print">
+                          <a:blip r:embed="rId21" cstate="print">
                             <a:extLst>
                               <a:ext uri="{28A0092B-C50C-407E-A947-70E740481C1C}">
                                 <a14:useLocalDpi xmlns:a14="http://schemas.microsoft.com/office/drawing/2010/main" val="0"/>
@@ -2890,6 +2889,7 @@
       </w:pPr>
       <w:bookmarkStart w:id="4" w:name="_Hlk115641074"/>
       <w:r>
+        <w:lastRenderedPageBreak/>
         <w:t xml:space="preserve"> </w:t>
       </w:r>
       <w:bookmarkStart w:id="5" w:name="_Hlk152251055"/>
@@ -2913,7 +2913,7 @@
       </w:tblGrid>
       <w:tr>
         <w:trPr>
-          <w:trHeight w:val="4910"/>
+          <w:trHeight w:val="3904"/>
         </w:trPr>
         <w:tc>
           <w:tcPr>
@@ -2928,9 +2928,9 @@
                 <w:noProof/>
               </w:rPr>
               <w:drawing>
-                <wp:inline distT="0" distB="0" distL="0" distR="0" wp14:anchorId="03A02615" wp14:editId="1CB0667E">
-                  <wp:extent cx="2950779" cy="2413000"/>
-                  <wp:effectExtent l="133350" t="114300" r="135890" b="158750"/>
+                <wp:inline distT="0" distB="0" distL="0" distR="0" wp14:anchorId="03A02615" wp14:editId="54D78CF5">
+                  <wp:extent cx="2741228" cy="2241639"/>
+                  <wp:effectExtent l="57150" t="38100" r="59690" b="82550"/>
                   <wp:docPr id="773974649" name="Picture 773974649"/>
                   <wp:cNvGraphicFramePr>
                     <a:graphicFrameLocks xmlns:a="http://schemas.openxmlformats.org/drawingml/2006/main" noChangeAspect="1"/>
@@ -2943,7 +2943,7 @@
                           <pic:cNvPicPr/>
                         </pic:nvPicPr>
                         <pic:blipFill>
-                          <a:blip r:embed="rId21" cstate="print">
+                          <a:blip r:embed="rId22" cstate="print">
                             <a:extLst>
                               <a:ext uri="{28A0092B-C50C-407E-A947-70E740481C1C}">
                                 <a14:useLocalDpi xmlns:a14="http://schemas.microsoft.com/office/drawing/2010/main" val="0"/>
@@ -2958,7 +2958,7 @@
                         <pic:spPr>
                           <a:xfrm>
                             <a:off x="0" y="0"/>
-                            <a:ext cx="2976285" cy="2433857"/>
+                            <a:ext cx="2767883" cy="2263436"/>
                           </a:xfrm>
                           <a:prstGeom prst="rect">
                             <a:avLst/>
@@ -2969,9 +2969,7 @@
                             </a:srgbClr>
                           </a:solidFill>
                           <a:ln w="88900" cap="sq">
-                            <a:solidFill>
-                              <a:srgbClr val="FFFFFF"/>
-                            </a:solidFill>
+                            <a:noFill/>
                             <a:miter lim="800000"/>
                           </a:ln>
                           <a:effectLst>
@@ -2981,18 +2979,6 @@
                               </a:srgbClr>
                             </a:outerShdw>
                           </a:effectLst>
-                          <a:scene3d>
-                            <a:camera prst="orthographicFront"/>
-                            <a:lightRig rig="twoPt" dir="t">
-                              <a:rot lat="0" lon="0" rev="7200000"/>
-                            </a:lightRig>
-                          </a:scene3d>
-                          <a:sp3d>
-                            <a:bevelT w="25400" h="19050"/>
-                            <a:contourClr>
-                              <a:srgbClr val="FFFFFF"/>
-                            </a:contourClr>
-                          </a:sp3d>
                         </pic:spPr>
                       </pic:pic>
                     </a:graphicData>
@@ -3081,7 +3067,6 @@
         <w:pStyle w:val="Heading2"/>
       </w:pPr>
       <w:r>
-        <w:lastRenderedPageBreak/>
         <w:t xml:space="preserve">Step </w:t>
       </w:r>
       <w:r>
@@ -3114,18 +3099,18 @@
               <mc:AlternateContent>
                 <mc:Choice Requires="wps">
                   <w:drawing>
-                    <wp:anchor distT="0" distB="0" distL="114300" distR="114300" simplePos="0" relativeHeight="251714560" behindDoc="0" locked="0" layoutInCell="1" allowOverlap="1" wp14:anchorId="7C51643E" wp14:editId="67479B4E">
+                    <wp:anchor distT="0" distB="0" distL="114300" distR="114300" simplePos="0" relativeHeight="251715584" behindDoc="0" locked="0" layoutInCell="1" allowOverlap="1" wp14:anchorId="77C8D121" wp14:editId="2AAB05FB">
                       <wp:simplePos x="0" y="0"/>
                       <wp:positionH relativeFrom="column">
-                        <wp:posOffset>1363345</wp:posOffset>
+                        <wp:posOffset>2214244</wp:posOffset>
                       </wp:positionH>
                       <wp:positionV relativeFrom="paragraph">
-                        <wp:posOffset>2155825</wp:posOffset>
+                        <wp:posOffset>2146556</wp:posOffset>
                       </wp:positionV>
-                      <wp:extent cx="247650" cy="298450"/>
-                      <wp:effectExtent l="0" t="0" r="19050" b="25400"/>
+                      <wp:extent cx="300251" cy="327546"/>
+                      <wp:effectExtent l="19050" t="19050" r="24130" b="15875"/>
                       <wp:wrapNone/>
-                      <wp:docPr id="592513019" name="Flowchart: Connector 11"/>
+                      <wp:docPr id="1114944708" name="Flowchart: Connector 12"/>
                       <wp:cNvGraphicFramePr/>
                       <a:graphic xmlns:a="http://schemas.openxmlformats.org/drawingml/2006/main">
                         <a:graphicData uri="http://schemas.microsoft.com/office/word/2010/wordprocessingShape">
@@ -3134,13 +3119,13 @@
                             <wps:spPr>
                               <a:xfrm>
                                 <a:off x="0" y="0"/>
-                                <a:ext cx="247650" cy="298450"/>
+                                <a:ext cx="300251" cy="327546"/>
                               </a:xfrm>
                               <a:prstGeom prst="flowChartConnector">
                                 <a:avLst/>
                               </a:prstGeom>
                               <a:noFill/>
-                              <a:ln w="19050">
+                              <a:ln w="28575">
                                 <a:solidFill>
                                   <a:srgbClr val="FF0000"/>
                                 </a:solidFill>
@@ -3182,7 +3167,10 @@
                 </mc:Choice>
                 <mc:Fallback>
                   <w:pict>
-                    <v:shape w14:anchorId="577C6F27" id="Flowchart: Connector 11" o:spid="_x0000_s1026" type="#_x0000_t120" style="position:absolute;margin-left:107.35pt;margin-top:169.75pt;width:19.5pt;height:23.5pt;z-index:251714560;visibility:visible;mso-wrap-style:square;mso-width-percent:0;mso-height-percent:0;mso-wrap-distance-left:9pt;mso-wrap-distance-top:0;mso-wrap-distance-right:9pt;mso-wrap-distance-bottom:0;mso-position-horizontal:absolute;mso-position-horizontal-relative:text;mso-position-vertical:absolute;mso-position-vertical-relative:text;mso-width-percent:0;mso-height-percent:0;mso-width-relative:margin;mso-height-relative:margin;v-text-anchor:middle" o:gfxdata="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" filled="f" strokecolor="red" strokeweight="1.5pt">
+                    <v:shapetype w14:anchorId="76480BD3" id="_x0000_t120" coordsize="21600,21600" o:spt="120" path="m10800,qx,10800,10800,21600,21600,10800,10800,xe">
+                      <v:path gradientshapeok="t" o:connecttype="custom" o:connectlocs="10800,0;3163,3163;0,10800;3163,18437;10800,21600;18437,18437;21600,10800;18437,3163" textboxrect="3163,3163,18437,18437"/>
+                    </v:shapetype>
+                    <v:shape id="Flowchart: Connector 12" o:spid="_x0000_s1026" type="#_x0000_t120" style="position:absolute;margin-left:174.35pt;margin-top:169pt;width:23.65pt;height:25.8pt;z-index:251715584;visibility:visible;mso-wrap-style:square;mso-width-percent:0;mso-height-percent:0;mso-wrap-distance-left:9pt;mso-wrap-distance-top:0;mso-wrap-distance-right:9pt;mso-wrap-distance-bottom:0;mso-position-horizontal:absolute;mso-position-horizontal-relative:text;mso-position-vertical:absolute;mso-position-vertical-relative:text;mso-width-percent:0;mso-height-percent:0;mso-width-relative:margin;mso-height-relative:margin;v-text-anchor:middle" o:gfxdata="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" filled="f" strokecolor="red" strokeweight="2.25pt">
                       <v:stroke joinstyle="miter"/>
                     </v:shape>
                   </w:pict>
@@ -3196,18 +3184,18 @@
               <mc:AlternateContent>
                 <mc:Choice Requires="wps">
                   <w:drawing>
-                    <wp:anchor distT="0" distB="0" distL="114300" distR="114300" simplePos="0" relativeHeight="251715584" behindDoc="0" locked="0" layoutInCell="1" allowOverlap="1" wp14:anchorId="77C8D121" wp14:editId="54F35E30">
+                    <wp:anchor distT="0" distB="0" distL="114300" distR="114300" simplePos="0" relativeHeight="251714560" behindDoc="0" locked="0" layoutInCell="1" allowOverlap="1" wp14:anchorId="7C51643E" wp14:editId="11FD53E4">
                       <wp:simplePos x="0" y="0"/>
                       <wp:positionH relativeFrom="column">
-                        <wp:posOffset>2245995</wp:posOffset>
+                        <wp:posOffset>1333964</wp:posOffset>
                       </wp:positionH>
                       <wp:positionV relativeFrom="paragraph">
-                        <wp:posOffset>2181225</wp:posOffset>
+                        <wp:posOffset>2132813</wp:posOffset>
                       </wp:positionV>
-                      <wp:extent cx="260350" cy="292100"/>
-                      <wp:effectExtent l="0" t="0" r="25400" b="12700"/>
+                      <wp:extent cx="309065" cy="327546"/>
+                      <wp:effectExtent l="19050" t="19050" r="15240" b="15875"/>
                       <wp:wrapNone/>
-                      <wp:docPr id="1114944708" name="Flowchart: Connector 12"/>
+                      <wp:docPr id="592513019" name="Flowchart: Connector 11"/>
                       <wp:cNvGraphicFramePr/>
                       <a:graphic xmlns:a="http://schemas.openxmlformats.org/drawingml/2006/main">
                         <a:graphicData uri="http://schemas.microsoft.com/office/word/2010/wordprocessingShape">
@@ -3216,13 +3204,13 @@
                             <wps:spPr>
                               <a:xfrm>
                                 <a:off x="0" y="0"/>
-                                <a:ext cx="260350" cy="292100"/>
+                                <a:ext cx="309065" cy="327546"/>
                               </a:xfrm>
                               <a:prstGeom prst="flowChartConnector">
                                 <a:avLst/>
                               </a:prstGeom>
                               <a:noFill/>
-                              <a:ln w="19050">
+                              <a:ln w="28575">
                                 <a:solidFill>
                                   <a:srgbClr val="FF0000"/>
                                 </a:solidFill>
@@ -3253,12 +3241,18 @@
                           </wps:wsp>
                         </a:graphicData>
                       </a:graphic>
+                      <wp14:sizeRelH relativeFrom="margin">
+                        <wp14:pctWidth>0</wp14:pctWidth>
+                      </wp14:sizeRelH>
+                      <wp14:sizeRelV relativeFrom="margin">
+                        <wp14:pctHeight>0</wp14:pctHeight>
+                      </wp14:sizeRelV>
                     </wp:anchor>
                   </w:drawing>
                 </mc:Choice>
                 <mc:Fallback>
                   <w:pict>
-                    <v:shape w14:anchorId="3025C273" id="Flowchart: Connector 12" o:spid="_x0000_s1026" type="#_x0000_t120" style="position:absolute;margin-left:176.85pt;margin-top:171.75pt;width:20.5pt;height:23pt;z-index:251715584;visibility:visible;mso-wrap-style:square;mso-wrap-distance-left:9pt;mso-wrap-distance-top:0;mso-wrap-distance-right:9pt;mso-wrap-distance-bottom:0;mso-position-horizontal:absolute;mso-position-horizontal-relative:text;mso-position-vertical:absolute;mso-position-vertical-relative:text;v-text-anchor:middle" o:gfxdata="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" filled="f" strokecolor="red" strokeweight="1.5pt">
+                    <v:shape w14:anchorId="3FB81634" id="Flowchart: Connector 11" o:spid="_x0000_s1026" type="#_x0000_t120" style="position:absolute;margin-left:105.05pt;margin-top:167.95pt;width:24.35pt;height:25.8pt;z-index:251714560;visibility:visible;mso-wrap-style:square;mso-width-percent:0;mso-height-percent:0;mso-wrap-distance-left:9pt;mso-wrap-distance-top:0;mso-wrap-distance-right:9pt;mso-wrap-distance-bottom:0;mso-position-horizontal:absolute;mso-position-horizontal-relative:text;mso-position-vertical:absolute;mso-position-vertical-relative:text;mso-width-percent:0;mso-height-percent:0;mso-width-relative:margin;mso-height-relative:margin;v-text-anchor:middle" o:gfxdata="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" filled="f" strokecolor="red" strokeweight="2.25pt">
                       <v:stroke joinstyle="miter"/>
                     </v:shape>
                   </w:pict>
@@ -3285,7 +3279,7 @@
                           <pic:cNvPicPr/>
                         </pic:nvPicPr>
                         <pic:blipFill rotWithShape="1">
-                          <a:blip r:embed="rId22">
+                          <a:blip r:embed="rId23">
                             <a:extLst>
                               <a:ext uri="{28A0092B-C50C-407E-A947-70E740481C1C}">
                                 <a14:useLocalDpi xmlns:a14="http://schemas.microsoft.com/office/drawing/2010/main" val="0"/>
@@ -3425,12 +3419,8 @@
       <w:pPr>
         <w:pStyle w:val="Heading2"/>
       </w:pPr>
-    </w:p>
-    <w:p>
-      <w:pPr>
-        <w:pStyle w:val="Heading2"/>
-      </w:pPr>
       <w:r>
+        <w:lastRenderedPageBreak/>
         <w:t xml:space="preserve">Step </w:t>
       </w:r>
       <w:r>
@@ -3444,16 +3434,16 @@
         <w:tblLook w:val="04A0" w:firstRow="1" w:lastRow="0" w:firstColumn="1" w:lastColumn="0" w:noHBand="0" w:noVBand="1"/>
       </w:tblPr>
       <w:tblGrid>
-        <w:gridCol w:w="5346"/>
-        <w:gridCol w:w="3863"/>
+        <w:gridCol w:w="4248"/>
+        <w:gridCol w:w="4961"/>
       </w:tblGrid>
       <w:tr>
         <w:trPr>
-          <w:trHeight w:val="4910"/>
+          <w:trHeight w:val="3762"/>
         </w:trPr>
         <w:tc>
           <w:tcPr>
-            <w:tcW w:w="5240" w:type="dxa"/>
+            <w:tcW w:w="4248" w:type="dxa"/>
           </w:tcPr>
           <w:p>
             <w:r>
@@ -3463,34 +3453,34 @@
               <mc:AlternateContent>
                 <mc:Choice Requires="wps">
                   <w:drawing>
-                    <wp:anchor distT="0" distB="0" distL="114300" distR="114300" simplePos="0" relativeHeight="251717632" behindDoc="0" locked="0" layoutInCell="1" allowOverlap="1" wp14:anchorId="22AE0432" wp14:editId="658CCA55">
+                    <wp:anchor distT="0" distB="0" distL="114300" distR="114300" simplePos="0" relativeHeight="251716608" behindDoc="0" locked="0" layoutInCell="1" allowOverlap="1" wp14:anchorId="6D15F6A8" wp14:editId="746EB2AB">
                       <wp:simplePos x="0" y="0"/>
                       <wp:positionH relativeFrom="column">
-                        <wp:posOffset>1649095</wp:posOffset>
+                        <wp:posOffset>1098862</wp:posOffset>
                       </wp:positionH>
                       <wp:positionV relativeFrom="paragraph">
-                        <wp:posOffset>1330325</wp:posOffset>
+                        <wp:posOffset>1143161</wp:posOffset>
                       </wp:positionV>
-                      <wp:extent cx="215900" cy="355600"/>
-                      <wp:effectExtent l="38100" t="38100" r="31750" b="25400"/>
+                      <wp:extent cx="31750" cy="444500"/>
+                      <wp:effectExtent l="76200" t="38100" r="44450" b="12700"/>
                       <wp:wrapNone/>
-                      <wp:docPr id="612866381" name="Straight Arrow Connector 16"/>
+                      <wp:docPr id="1419463739" name="Straight Arrow Connector 15"/>
                       <wp:cNvGraphicFramePr/>
                       <a:graphic xmlns:a="http://schemas.openxmlformats.org/drawingml/2006/main">
                         <a:graphicData uri="http://schemas.microsoft.com/office/word/2010/wordprocessingShape">
                           <wps:wsp>
                             <wps:cNvCnPr/>
                             <wps:spPr>
-                              <a:xfrm flipH="1" flipV="1">
+                              <a:xfrm flipV="1">
                                 <a:off x="0" y="0"/>
-                                <a:ext cx="215900" cy="355600"/>
+                                <a:ext cx="31750" cy="444500"/>
                               </a:xfrm>
                               <a:prstGeom prst="straightConnector1">
                                 <a:avLst/>
                               </a:prstGeom>
-                              <a:ln w="28575">
+                              <a:ln w="38100">
                                 <a:solidFill>
-                                  <a:srgbClr val="FF0000"/>
+                                  <a:schemeClr val="bg1"/>
                                 </a:solidFill>
                                 <a:tailEnd type="triangle"/>
                               </a:ln>
@@ -3518,7 +3508,7 @@
                 </mc:Choice>
                 <mc:Fallback>
                   <w:pict>
-                    <v:shape w14:anchorId="358907D4" id="Straight Arrow Connector 16" o:spid="_x0000_s1026" type="#_x0000_t32" style="position:absolute;margin-left:129.85pt;margin-top:104.75pt;width:17pt;height:28pt;flip:x y;z-index:251717632;visibility:visible;mso-wrap-style:square;mso-wrap-distance-left:9pt;mso-wrap-distance-top:0;mso-wrap-distance-right:9pt;mso-wrap-distance-bottom:0;mso-position-horizontal:absolute;mso-position-horizontal-relative:text;mso-position-vertical:absolute;mso-position-vertical-relative:text" o:gfxdata="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" strokecolor="red" strokeweight="2.25pt">
+                    <v:shape w14:anchorId="53BF9FEA" id="Straight Arrow Connector 15" o:spid="_x0000_s1026" type="#_x0000_t32" style="position:absolute;margin-left:86.5pt;margin-top:90pt;width:2.5pt;height:35pt;flip:y;z-index:251716608;visibility:visible;mso-wrap-style:square;mso-wrap-distance-left:9pt;mso-wrap-distance-top:0;mso-wrap-distance-right:9pt;mso-wrap-distance-bottom:0;mso-position-horizontal:absolute;mso-position-horizontal-relative:text;mso-position-vertical:absolute;mso-position-vertical-relative:text" o:gfxdata="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" strokecolor="white [3212]" strokeweight="3pt">
                       <v:stroke endarrow="block" joinstyle="miter"/>
                     </v:shape>
                   </w:pict>
@@ -3532,34 +3522,34 @@
               <mc:AlternateContent>
                 <mc:Choice Requires="wps">
                   <w:drawing>
-                    <wp:anchor distT="0" distB="0" distL="114300" distR="114300" simplePos="0" relativeHeight="251716608" behindDoc="0" locked="0" layoutInCell="1" allowOverlap="1" wp14:anchorId="6D15F6A8" wp14:editId="6734DB62">
+                    <wp:anchor distT="0" distB="0" distL="114300" distR="114300" simplePos="0" relativeHeight="251717632" behindDoc="0" locked="0" layoutInCell="1" allowOverlap="1" wp14:anchorId="22AE0432" wp14:editId="666D19DD">
                       <wp:simplePos x="0" y="0"/>
                       <wp:positionH relativeFrom="column">
-                        <wp:posOffset>1331595</wp:posOffset>
+                        <wp:posOffset>1280606</wp:posOffset>
                       </wp:positionH>
                       <wp:positionV relativeFrom="paragraph">
-                        <wp:posOffset>1368425</wp:posOffset>
+                        <wp:posOffset>1111960</wp:posOffset>
                       </wp:positionV>
-                      <wp:extent cx="31750" cy="444500"/>
-                      <wp:effectExtent l="57150" t="38100" r="44450" b="12700"/>
+                      <wp:extent cx="215900" cy="355600"/>
+                      <wp:effectExtent l="38100" t="38100" r="31750" b="25400"/>
                       <wp:wrapNone/>
-                      <wp:docPr id="1419463739" name="Straight Arrow Connector 15"/>
+                      <wp:docPr id="612866381" name="Straight Arrow Connector 16"/>
                       <wp:cNvGraphicFramePr/>
                       <a:graphic xmlns:a="http://schemas.openxmlformats.org/drawingml/2006/main">
                         <a:graphicData uri="http://schemas.microsoft.com/office/word/2010/wordprocessingShape">
                           <wps:wsp>
                             <wps:cNvCnPr/>
                             <wps:spPr>
-                              <a:xfrm flipV="1">
+                              <a:xfrm flipH="1" flipV="1">
                                 <a:off x="0" y="0"/>
-                                <a:ext cx="31750" cy="444500"/>
+                                <a:ext cx="215900" cy="355600"/>
                               </a:xfrm>
                               <a:prstGeom prst="straightConnector1">
                                 <a:avLst/>
                               </a:prstGeom>
-                              <a:ln w="28575">
+                              <a:ln w="38100">
                                 <a:solidFill>
-                                  <a:srgbClr val="FF0000"/>
+                                  <a:schemeClr val="bg1"/>
                                 </a:solidFill>
                                 <a:tailEnd type="triangle"/>
                               </a:ln>
@@ -3587,7 +3577,7 @@
                 </mc:Choice>
                 <mc:Fallback>
                   <w:pict>
-                    <v:shape w14:anchorId="349F05DE" id="Straight Arrow Connector 15" o:spid="_x0000_s1026" type="#_x0000_t32" style="position:absolute;margin-left:104.85pt;margin-top:107.75pt;width:2.5pt;height:35pt;flip:y;z-index:251716608;visibility:visible;mso-wrap-style:square;mso-wrap-distance-left:9pt;mso-wrap-distance-top:0;mso-wrap-distance-right:9pt;mso-wrap-distance-bottom:0;mso-position-horizontal:absolute;mso-position-horizontal-relative:text;mso-position-vertical:absolute;mso-position-vertical-relative:text" o:gfxdata="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" strokecolor="red" strokeweight="2.25pt">
+                    <v:shape w14:anchorId="5C5E936C" id="Straight Arrow Connector 16" o:spid="_x0000_s1026" type="#_x0000_t32" style="position:absolute;margin-left:100.85pt;margin-top:87.55pt;width:17pt;height:28pt;flip:x y;z-index:251717632;visibility:visible;mso-wrap-style:square;mso-wrap-distance-left:9pt;mso-wrap-distance-top:0;mso-wrap-distance-right:9pt;mso-wrap-distance-bottom:0;mso-position-horizontal:absolute;mso-position-horizontal-relative:text;mso-position-vertical:absolute;mso-position-vertical-relative:text" o:gfxdata="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" strokecolor="white [3212]" strokeweight="3pt">
                       <v:stroke endarrow="block" joinstyle="miter"/>
                     </v:shape>
                   </w:pict>
@@ -3602,9 +3592,9 @@
                 <w:noProof/>
               </w:rPr>
               <w:drawing>
-                <wp:inline distT="0" distB="0" distL="0" distR="0" wp14:anchorId="77D74D13" wp14:editId="402BFDAE">
-                  <wp:extent cx="3251200" cy="2438400"/>
-                  <wp:effectExtent l="0" t="0" r="6350" b="0"/>
+                <wp:inline distT="0" distB="0" distL="0" distR="0" wp14:anchorId="77D74D13" wp14:editId="55C948AD">
+                  <wp:extent cx="2476614" cy="1991672"/>
+                  <wp:effectExtent l="0" t="0" r="0" b="8890"/>
                   <wp:docPr id="754809790" name="Picture 13" descr="A close up of a device&#10;&#10;Description automatically generated"/>
                   <wp:cNvGraphicFramePr>
                     <a:graphicFrameLocks xmlns:a="http://schemas.openxmlformats.org/drawingml/2006/main" noChangeAspect="1"/>
@@ -3616,26 +3606,35 @@
                           <pic:cNvPr id="754809790" name="Picture 13" descr="A close up of a device&#10;&#10;Description automatically generated"/>
                           <pic:cNvPicPr/>
                         </pic:nvPicPr>
-                        <pic:blipFill>
-                          <a:blip r:embed="rId23" cstate="print">
+                        <pic:blipFill rotWithShape="1">
+                          <a:blip r:embed="rId24" cstate="print">
                             <a:extLst>
                               <a:ext uri="{28A0092B-C50C-407E-A947-70E740481C1C}">
                                 <a14:useLocalDpi xmlns:a14="http://schemas.microsoft.com/office/drawing/2010/main" val="0"/>
                               </a:ext>
                             </a:extLst>
                           </a:blip>
+                          <a:srcRect l="10079" r="13711" b="18283"/>
                           <a:stretch>
                             <a:fillRect/>
                           </a:stretch>
                         </pic:blipFill>
-                        <pic:spPr>
+                        <pic:spPr bwMode="auto">
                           <a:xfrm>
                             <a:off x="0" y="0"/>
-                            <a:ext cx="3256248" cy="2442186"/>
+                            <a:ext cx="2477735" cy="1992573"/>
                           </a:xfrm>
                           <a:prstGeom prst="rect">
                             <a:avLst/>
                           </a:prstGeom>
+                          <a:ln>
+                            <a:noFill/>
+                          </a:ln>
+                          <a:extLst>
+                            <a:ext uri="{53640926-AAD7-44D8-BBD7-CCE9431645EC}">
+                              <a14:shadowObscured xmlns:a14="http://schemas.microsoft.com/office/drawing/2010/main"/>
+                            </a:ext>
+                          </a:extLst>
                         </pic:spPr>
                       </pic:pic>
                     </a:graphicData>
@@ -3647,7 +3646,7 @@
         </w:tc>
         <w:tc>
           <w:tcPr>
-            <w:tcW w:w="3969" w:type="dxa"/>
+            <w:tcW w:w="4961" w:type="dxa"/>
           </w:tcPr>
           <w:p>
             <w:pPr>
@@ -3757,6 +3756,7 @@
             <w:pPr>
               <w:pStyle w:val="ListParagraph"/>
               <w:spacing w:after="160" w:line="259" w:lineRule="auto"/>
+              <w:ind w:left="360"/>
             </w:pPr>
             <w:r>
               <w:rPr>
@@ -3785,11 +3785,6 @@
         </w:tc>
       </w:tr>
     </w:tbl>
-    <w:p>
-      <w:pPr>
-        <w:pStyle w:val="Heading2"/>
-      </w:pPr>
-    </w:p>
     <w:p>
       <w:pPr>
         <w:pStyle w:val="Heading2"/>
@@ -3808,8 +3803,8 @@
         <w:tblLook w:val="04A0" w:firstRow="1" w:lastRow="0" w:firstColumn="1" w:lastColumn="0" w:noHBand="0" w:noVBand="1"/>
       </w:tblPr>
       <w:tblGrid>
-        <w:gridCol w:w="4746"/>
-        <w:gridCol w:w="4604"/>
+        <w:gridCol w:w="5856"/>
+        <w:gridCol w:w="3494"/>
       </w:tblGrid>
       <w:tr>
         <w:tc>
@@ -3827,13 +3822,13 @@
               <mc:AlternateContent>
                 <mc:Choice Requires="wps">
                   <w:drawing>
-                    <wp:anchor distT="0" distB="0" distL="114300" distR="114300" simplePos="0" relativeHeight="251718656" behindDoc="0" locked="0" layoutInCell="1" allowOverlap="1" wp14:anchorId="53734806" wp14:editId="265BFCC0">
+                    <wp:anchor distT="0" distB="0" distL="114300" distR="114300" simplePos="0" relativeHeight="251718656" behindDoc="0" locked="0" layoutInCell="1" allowOverlap="1" wp14:anchorId="53734806" wp14:editId="0A7A4AD5">
                       <wp:simplePos x="0" y="0"/>
                       <wp:positionH relativeFrom="column">
-                        <wp:posOffset>690245</wp:posOffset>
+                        <wp:posOffset>2294255</wp:posOffset>
                       </wp:positionH>
                       <wp:positionV relativeFrom="paragraph">
-                        <wp:posOffset>2422525</wp:posOffset>
+                        <wp:posOffset>1753245</wp:posOffset>
                       </wp:positionV>
                       <wp:extent cx="209550" cy="196850"/>
                       <wp:effectExtent l="0" t="0" r="19050" b="12700"/>
@@ -3886,7 +3881,7 @@
                 </mc:Choice>
                 <mc:Fallback>
                   <w:pict>
-                    <v:shape w14:anchorId="41222C74" id="Flowchart: Connector 18" o:spid="_x0000_s1026" type="#_x0000_t120" style="position:absolute;margin-left:54.35pt;margin-top:190.75pt;width:16.5pt;height:15.5pt;z-index:251718656;visibility:visible;mso-wrap-style:square;mso-wrap-distance-left:9pt;mso-wrap-distance-top:0;mso-wrap-distance-right:9pt;mso-wrap-distance-bottom:0;mso-position-horizontal:absolute;mso-position-horizontal-relative:text;mso-position-vertical:absolute;mso-position-vertical-relative:text;v-text-anchor:middle" o:gfxdata="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" fillcolor="black [3213]" strokecolor="#05050d [484]" strokeweight="1pt">
+                    <v:shape w14:anchorId="641B5EDE" id="Flowchart: Connector 18" o:spid="_x0000_s1026" type="#_x0000_t120" style="position:absolute;margin-left:180.65pt;margin-top:138.05pt;width:16.5pt;height:15.5pt;z-index:251718656;visibility:visible;mso-wrap-style:square;mso-wrap-distance-left:9pt;mso-wrap-distance-top:0;mso-wrap-distance-right:9pt;mso-wrap-distance-bottom:0;mso-position-horizontal:absolute;mso-position-horizontal-relative:text;mso-position-vertical:absolute;mso-position-vertical-relative:text;v-text-anchor:middle" o:gfxdata="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" fillcolor="black [3213]" strokecolor="#05050d [484]" strokeweight="1pt">
                       <v:stroke joinstyle="miter"/>
                     </v:shape>
                   </w:pict>
@@ -3898,9 +3893,9 @@
                 <w:noProof/>
               </w:rPr>
               <w:drawing>
-                <wp:inline distT="0" distB="0" distL="0" distR="0" wp14:anchorId="0790BC0F" wp14:editId="31FC16AF">
-                  <wp:extent cx="2871788" cy="3829050"/>
-                  <wp:effectExtent l="0" t="0" r="5080" b="0"/>
+                <wp:inline distT="0" distB="0" distL="0" distR="0" wp14:anchorId="0790BC0F" wp14:editId="2E77C537">
+                  <wp:extent cx="2251949" cy="3574350"/>
+                  <wp:effectExtent l="5715" t="0" r="1905" b="1905"/>
                   <wp:docPr id="1591250289" name="Picture 17" descr="A plastic piece of electronic device&#10;&#10;Description automatically generated with medium confidence"/>
                   <wp:cNvGraphicFramePr>
                     <a:graphicFrameLocks xmlns:a="http://schemas.openxmlformats.org/drawingml/2006/main" noChangeAspect="1"/>
@@ -3912,26 +3907,35 @@
                           <pic:cNvPr id="1591250289" name="Picture 17" descr="A plastic piece of electronic device&#10;&#10;Description automatically generated with medium confidence"/>
                           <pic:cNvPicPr/>
                         </pic:nvPicPr>
-                        <pic:blipFill>
-                          <a:blip r:embed="rId24" cstate="print">
+                        <pic:blipFill rotWithShape="1">
+                          <a:blip r:embed="rId25" cstate="print">
                             <a:extLst>
                               <a:ext uri="{28A0092B-C50C-407E-A947-70E740481C1C}">
                                 <a14:useLocalDpi xmlns:a14="http://schemas.microsoft.com/office/drawing/2010/main" val="0"/>
                               </a:ext>
                             </a:extLst>
                           </a:blip>
+                          <a:srcRect l="15997"/>
                           <a:stretch>
                             <a:fillRect/>
                           </a:stretch>
                         </pic:blipFill>
-                        <pic:spPr>
-                          <a:xfrm>
+                        <pic:spPr bwMode="auto">
+                          <a:xfrm rot="16200000">
                             <a:off x="0" y="0"/>
-                            <a:ext cx="2877618" cy="3836823"/>
+                            <a:ext cx="2261675" cy="3589787"/>
                           </a:xfrm>
                           <a:prstGeom prst="rect">
                             <a:avLst/>
                           </a:prstGeom>
+                          <a:ln>
+                            <a:noFill/>
+                          </a:ln>
+                          <a:extLst>
+                            <a:ext uri="{53640926-AAD7-44D8-BBD7-CCE9431645EC}">
+                              <a14:shadowObscured xmlns:a14="http://schemas.microsoft.com/office/drawing/2010/main"/>
+                            </a:ext>
+                          </a:extLst>
                         </pic:spPr>
                       </pic:pic>
                     </a:graphicData>
@@ -4080,7 +4084,6 @@
         </w:tc>
       </w:tr>
     </w:tbl>
-    <w:p/>
     <w:p>
       <w:pPr>
         <w:pStyle w:val="Heading2"/>
@@ -4107,16 +4110,18 @@
           <w:tcPr>
             <w:tcW w:w="4815" w:type="dxa"/>
           </w:tcPr>
-          <w:p/>
           <w:p>
+            <w:pPr>
+              <w:jc w:val="center"/>
+            </w:pPr>
             <w:r>
               <w:rPr>
                 <w:noProof/>
               </w:rPr>
               <w:drawing>
-                <wp:inline distT="0" distB="0" distL="0" distR="0" wp14:anchorId="6FE0BD9B" wp14:editId="0A2C1D61">
-                  <wp:extent cx="1651000" cy="2431798"/>
-                  <wp:effectExtent l="0" t="0" r="6350" b="6985"/>
+                <wp:inline distT="0" distB="0" distL="0" distR="0" wp14:anchorId="6FE0BD9B" wp14:editId="34E88EAC">
+                  <wp:extent cx="1290548" cy="1978926"/>
+                  <wp:effectExtent l="0" t="0" r="5080" b="2540"/>
                   <wp:docPr id="73895121" name="Picture 1"/>
                   <wp:cNvGraphicFramePr>
                     <a:graphicFrameLocks xmlns:a="http://schemas.openxmlformats.org/drawingml/2006/main" noChangeAspect="1"/>
@@ -4128,20 +4133,29 @@
                           <pic:cNvPr id="73895121" name=""/>
                           <pic:cNvPicPr/>
                         </pic:nvPicPr>
-                        <pic:blipFill>
-                          <a:blip r:embed="rId25"/>
+                        <pic:blipFill rotWithShape="1">
+                          <a:blip r:embed="rId26"/>
+                          <a:srcRect r="3944"/>
                           <a:stretch>
                             <a:fillRect/>
                           </a:stretch>
                         </pic:blipFill>
-                        <pic:spPr>
+                        <pic:spPr bwMode="auto">
                           <a:xfrm>
                             <a:off x="0" y="0"/>
-                            <a:ext cx="1653419" cy="2435362"/>
+                            <a:ext cx="1296401" cy="1987901"/>
                           </a:xfrm>
                           <a:prstGeom prst="rect">
                             <a:avLst/>
                           </a:prstGeom>
+                          <a:ln>
+                            <a:noFill/>
+                          </a:ln>
+                          <a:extLst>
+                            <a:ext uri="{53640926-AAD7-44D8-BBD7-CCE9431645EC}">
+                              <a14:shadowObscured xmlns:a14="http://schemas.microsoft.com/office/drawing/2010/main"/>
+                            </a:ext>
+                          </a:extLst>
                         </pic:spPr>
                       </pic:pic>
                     </a:graphicData>
@@ -4303,10 +4317,17 @@
         </w:tc>
       </w:tr>
     </w:tbl>
-    <w:p/>
+    <w:p>
+      <w:pPr>
+        <w:rPr>
+          <w:sz w:val="2"/>
+          <w:szCs w:val="2"/>
+        </w:rPr>
+      </w:pPr>
+    </w:p>
     <w:sectPr>
-      <w:headerReference w:type="default" r:id="rId26"/>
-      <w:footerReference w:type="default" r:id="rId27"/>
+      <w:headerReference w:type="default" r:id="rId27"/>
+      <w:footerReference w:type="default" r:id="rId28"/>
       <w:pgSz w:w="12240" w:h="15840"/>
       <w:pgMar w:top="1440" w:right="1440" w:bottom="1440" w:left="1440" w:header="720" w:footer="708" w:gutter="0"/>
       <w:cols w:space="708"/>
@@ -4317,7 +4338,7 @@
 </file>
 
 <file path=word/endnotes.xml><?xml version="1.0" encoding="utf-8"?>
-<w:endnotes xmlns:wpc="http://schemas.microsoft.com/office/word/2010/wordprocessingCanvas" xmlns:cx="http://schemas.microsoft.com/office/drawing/2014/chartex" xmlns:cx1="http://schemas.microsoft.com/office/drawing/2015/9/8/chartex" xmlns:cx2="http://schemas.microsoft.com/office/drawing/2015/10/21/chartex" xmlns:cx3="http://schemas.microsoft.com/office/drawing/2016/5/9/chartex" xmlns:cx4="http://schemas.microsoft.com/office/drawing/2016/5/10/chartex" xmlns:cx5="http://schemas.microsoft.com/office/drawing/2016/5/11/chartex" xmlns:cx6="http://schemas.microsoft.com/office/drawing/2016/5/12/chartex" xmlns:cx7="http://schemas.microsoft.com/office/drawing/2016/5/13/chartex" xmlns:cx8="http://schemas.microsoft.com/office/drawing/2016/5/14/chartex" xmlns:mc="http://schemas.openxmlformats.org/markup-compatibility/2006" xmlns:aink="http://schemas.microsoft.com/office/drawing/2016/ink" xmlns:am3d="http://schemas.microsoft.com/office/drawing/2017/model3d" xmlns:o="urn:schemas-microsoft-com:office:office" xmlns:oel="http://schemas.microsoft.com/office/2019/extlst" xmlns:r="http://schemas.openxmlformats.org/officeDocument/2006/relationships" xmlns:m="http://schemas.openxmlformats.org/officeDocument/2006/math" xmlns:v="urn:schemas-microsoft-com:vml" xmlns:wp14="http://schemas.microsoft.com/office/word/2010/wordprocessingDrawing" xmlns:wp="http://schemas.openxmlformats.org/drawingml/2006/wordprocessingDrawing" xmlns:w10="urn:schemas-microsoft-com:office:word" xmlns:w="http://schemas.openxmlformats.org/wordprocessingml/2006/main" xmlns:w14="http://schemas.microsoft.com/office/word/2010/wordml" xmlns:w15="http://schemas.microsoft.com/office/word/2012/wordml" xmlns:w16cex="http://schemas.microsoft.com/office/word/2018/wordml/cex" xmlns:w16cid="http://schemas.microsoft.com/office/word/2016/wordml/cid" xmlns:w16="http://schemas.microsoft.com/office/word/2018/wordml" xmlns:w16du="http://schemas.microsoft.com/office/word/2023/wordml/word16du" xmlns:w16sdtdh="http://schemas.microsoft.com/office/word/2020/wordml/sdtdatahash" xmlns:w16sdtfl="http://schemas.microsoft.com/office/word/2024/wordml/sdtformatlock" xmlns:w16se="http://schemas.microsoft.com/office/word/2015/wordml/symex" xmlns:wpg="http://schemas.microsoft.com/office/word/2010/wordprocessingGroup" xmlns:wpi="http://schemas.microsoft.com/office/word/2010/wordprocessingInk" xmlns:wne="http://schemas.microsoft.com/office/word/2006/wordml" xmlns:wps="http://schemas.microsoft.com/office/word/2010/wordprocessingShape" mc:Ignorable="w14 w15 w16se w16cid w16 w16cex w16sdtdh w16sdtfl w16du wp14">
+<w:endnotes xmlns:wpc="http://schemas.microsoft.com/office/word/2010/wordprocessingCanvas" xmlns:cx="http://schemas.microsoft.com/office/drawing/2014/chartex" xmlns:cx1="http://schemas.microsoft.com/office/drawing/2015/9/8/chartex" xmlns:cx2="http://schemas.microsoft.com/office/drawing/2015/10/21/chartex" xmlns:cx3="http://schemas.microsoft.com/office/drawing/2016/5/9/chartex" xmlns:cx4="http://schemas.microsoft.com/office/drawing/2016/5/10/chartex" xmlns:cx5="http://schemas.microsoft.com/office/drawing/2016/5/11/chartex" xmlns:cx6="http://schemas.microsoft.com/office/drawing/2016/5/12/chartex" xmlns:cx7="http://schemas.microsoft.com/office/drawing/2016/5/13/chartex" xmlns:cx8="http://schemas.microsoft.com/office/drawing/2016/5/14/chartex" xmlns:mc="http://schemas.openxmlformats.org/markup-compatibility/2006" xmlns:aink="http://schemas.microsoft.com/office/drawing/2016/ink" xmlns:am3d="http://schemas.microsoft.com/office/drawing/2017/model3d" xmlns:o="urn:schemas-microsoft-com:office:office" xmlns:oel="http://schemas.microsoft.com/office/2019/extlst" xmlns:r="http://schemas.openxmlformats.org/officeDocument/2006/relationships" xmlns:m="http://schemas.openxmlformats.org/officeDocument/2006/math" xmlns:v="urn:schemas-microsoft-com:vml" xmlns:wp14="http://schemas.microsoft.com/office/word/2010/wordprocessingDrawing" xmlns:wp="http://schemas.openxmlformats.org/drawingml/2006/wordprocessingDrawing" xmlns:w10="urn:schemas-microsoft-com:office:word" xmlns:w="http://schemas.openxmlformats.org/wordprocessingml/2006/main" xmlns:w14="http://schemas.microsoft.com/office/word/2010/wordml" xmlns:w15="http://schemas.microsoft.com/office/word/2012/wordml" xmlns:w16cei="http://schemas.microsoft.com/office/word/2026/wordml/cei" xmlns:w16cex="http://schemas.microsoft.com/office/word/2018/wordml/cex" xmlns:w16cid="http://schemas.microsoft.com/office/word/2016/wordml/cid" xmlns:w16="http://schemas.microsoft.com/office/word/2018/wordml" xmlns:w16du="http://schemas.microsoft.com/office/word/2023/wordml/word16du" xmlns:w16sdtdh="http://schemas.microsoft.com/office/word/2020/wordml/sdtdatahash" xmlns:w16sdtfl="http://schemas.microsoft.com/office/word/2024/wordml/sdtformatlock" xmlns:w16se="http://schemas.microsoft.com/office/word/2015/wordml/symex" xmlns:wpg="http://schemas.microsoft.com/office/word/2010/wordprocessingGroup" xmlns:wpi="http://schemas.microsoft.com/office/word/2010/wordprocessingInk" xmlns:wne="http://schemas.microsoft.com/office/word/2006/wordml" xmlns:wps="http://schemas.microsoft.com/office/word/2010/wordprocessingShape" mc:Ignorable="w14 w15 w16se w16cid w16 w16cex w16sdtdh w16sdtfl w16du wp14">
   <w:endnote w:type="separator" w:id="-1">
     <w:p>
       <w:pPr>
@@ -4342,7 +4363,7 @@
 </file>
 
 <file path=word/footer1.xml><?xml version="1.0" encoding="utf-8"?>
-<w:ftr xmlns:wpc="http://schemas.microsoft.com/office/word/2010/wordprocessingCanvas" xmlns:cx="http://schemas.microsoft.com/office/drawing/2014/chartex" xmlns:cx1="http://schemas.microsoft.com/office/drawing/2015/9/8/chartex" xmlns:cx2="http://schemas.microsoft.com/office/drawing/2015/10/21/chartex" xmlns:cx3="http://schemas.microsoft.com/office/drawing/2016/5/9/chartex" xmlns:cx4="http://schemas.microsoft.com/office/drawing/2016/5/10/chartex" xmlns:cx5="http://schemas.microsoft.com/office/drawing/2016/5/11/chartex" xmlns:cx6="http://schemas.microsoft.com/office/drawing/2016/5/12/chartex" xmlns:cx7="http://schemas.microsoft.com/office/drawing/2016/5/13/chartex" xmlns:cx8="http://schemas.microsoft.com/office/drawing/2016/5/14/chartex" xmlns:mc="http://schemas.openxmlformats.org/markup-compatibility/2006" xmlns:aink="http://schemas.microsoft.com/office/drawing/2016/ink" xmlns:am3d="http://schemas.microsoft.com/office/drawing/2017/model3d" xmlns:o="urn:schemas-microsoft-com:office:office" xmlns:oel="http://schemas.microsoft.com/office/2019/extlst" xmlns:r="http://schemas.openxmlformats.org/officeDocument/2006/relationships" xmlns:m="http://schemas.openxmlformats.org/officeDocument/2006/math" xmlns:v="urn:schemas-microsoft-com:vml" xmlns:wp14="http://schemas.microsoft.com/office/word/2010/wordprocessingDrawing" xmlns:wp="http://schemas.openxmlformats.org/drawingml/2006/wordprocessingDrawing" xmlns:w10="urn:schemas-microsoft-com:office:word" xmlns:w="http://schemas.openxmlformats.org/wordprocessingml/2006/main" xmlns:w14="http://schemas.microsoft.com/office/word/2010/wordml" xmlns:w15="http://schemas.microsoft.com/office/word/2012/wordml" xmlns:w16cex="http://schemas.microsoft.com/office/word/2018/wordml/cex" xmlns:w16cid="http://schemas.microsoft.com/office/word/2016/wordml/cid" xmlns:w16="http://schemas.microsoft.com/office/word/2018/wordml" xmlns:w16du="http://schemas.microsoft.com/office/word/2023/wordml/word16du" xmlns:w16sdtdh="http://schemas.microsoft.com/office/word/2020/wordml/sdtdatahash" xmlns:w16sdtfl="http://schemas.microsoft.com/office/word/2024/wordml/sdtformatlock" xmlns:w16se="http://schemas.microsoft.com/office/word/2015/wordml/symex" xmlns:wpg="http://schemas.microsoft.com/office/word/2010/wordprocessingGroup" xmlns:wpi="http://schemas.microsoft.com/office/word/2010/wordprocessingInk" xmlns:wne="http://schemas.microsoft.com/office/word/2006/wordml" xmlns:wps="http://schemas.microsoft.com/office/word/2010/wordprocessingShape" mc:Ignorable="w14 w15 w16se w16cid w16 w16cex w16sdtdh w16sdtfl w16du wp14">
+<w:ftr xmlns:wpc="http://schemas.microsoft.com/office/word/2010/wordprocessingCanvas" xmlns:cx="http://schemas.microsoft.com/office/drawing/2014/chartex" xmlns:cx1="http://schemas.microsoft.com/office/drawing/2015/9/8/chartex" xmlns:cx2="http://schemas.microsoft.com/office/drawing/2015/10/21/chartex" xmlns:cx3="http://schemas.microsoft.com/office/drawing/2016/5/9/chartex" xmlns:cx4="http://schemas.microsoft.com/office/drawing/2016/5/10/chartex" xmlns:cx5="http://schemas.microsoft.com/office/drawing/2016/5/11/chartex" xmlns:cx6="http://schemas.microsoft.com/office/drawing/2016/5/12/chartex" xmlns:cx7="http://schemas.microsoft.com/office/drawing/2016/5/13/chartex" xmlns:cx8="http://schemas.microsoft.com/office/drawing/2016/5/14/chartex" xmlns:mc="http://schemas.openxmlformats.org/markup-compatibility/2006" xmlns:aink="http://schemas.microsoft.com/office/drawing/2016/ink" xmlns:am3d="http://schemas.microsoft.com/office/drawing/2017/model3d" xmlns:o="urn:schemas-microsoft-com:office:office" xmlns:oel="http://schemas.microsoft.com/office/2019/extlst" xmlns:r="http://schemas.openxmlformats.org/officeDocument/2006/relationships" xmlns:m="http://schemas.openxmlformats.org/officeDocument/2006/math" xmlns:v="urn:schemas-microsoft-com:vml" xmlns:wp14="http://schemas.microsoft.com/office/word/2010/wordprocessingDrawing" xmlns:wp="http://schemas.openxmlformats.org/drawingml/2006/wordprocessingDrawing" xmlns:w10="urn:schemas-microsoft-com:office:word" xmlns:w="http://schemas.openxmlformats.org/wordprocessingml/2006/main" xmlns:w14="http://schemas.microsoft.com/office/word/2010/wordml" xmlns:w15="http://schemas.microsoft.com/office/word/2012/wordml" xmlns:w16cei="http://schemas.microsoft.com/office/word/2026/wordml/cei" xmlns:w16cex="http://schemas.microsoft.com/office/word/2018/wordml/cex" xmlns:w16cid="http://schemas.microsoft.com/office/word/2016/wordml/cid" xmlns:w16="http://schemas.microsoft.com/office/word/2018/wordml" xmlns:w16du="http://schemas.microsoft.com/office/word/2023/wordml/word16du" xmlns:w16sdtdh="http://schemas.microsoft.com/office/word/2020/wordml/sdtdatahash" xmlns:w16sdtfl="http://schemas.microsoft.com/office/word/2024/wordml/sdtformatlock" xmlns:w16se="http://schemas.microsoft.com/office/word/2015/wordml/symex" xmlns:wpg="http://schemas.microsoft.com/office/word/2010/wordprocessingGroup" xmlns:wpi="http://schemas.microsoft.com/office/word/2010/wordprocessingInk" xmlns:wne="http://schemas.microsoft.com/office/word/2006/wordml" xmlns:wps="http://schemas.microsoft.com/office/word/2010/wordprocessingShape" mc:Ignorable="w14 w15 w16se w16cid w16 w16cex w16sdtdh w16sdtfl w16du wp14">
   <w:p>
     <w:pPr>
       <w:pStyle w:val="Header"/>
@@ -4643,7 +4664,7 @@
 </file>
 
 <file path=word/footnotes.xml><?xml version="1.0" encoding="utf-8"?>
-<w:footnotes xmlns:wpc="http://schemas.microsoft.com/office/word/2010/wordprocessingCanvas" xmlns:cx="http://schemas.microsoft.com/office/drawing/2014/chartex" xmlns:cx1="http://schemas.microsoft.com/office/drawing/2015/9/8/chartex" xmlns:cx2="http://schemas.microsoft.com/office/drawing/2015/10/21/chartex" xmlns:cx3="http://schemas.microsoft.com/office/drawing/2016/5/9/chartex" xmlns:cx4="http://schemas.microsoft.com/office/drawing/2016/5/10/chartex" xmlns:cx5="http://schemas.microsoft.com/office/drawing/2016/5/11/chartex" xmlns:cx6="http://schemas.microsoft.com/office/drawing/2016/5/12/chartex" xmlns:cx7="http://schemas.microsoft.com/office/drawing/2016/5/13/chartex" xmlns:cx8="http://schemas.microsoft.com/office/drawing/2016/5/14/chartex" xmlns:mc="http://schemas.openxmlformats.org/markup-compatibility/2006" xmlns:aink="http://schemas.microsoft.com/office/drawing/2016/ink" xmlns:am3d="http://schemas.microsoft.com/office/drawing/2017/model3d" xmlns:o="urn:schemas-microsoft-com:office:office" xmlns:oel="http://schemas.microsoft.com/office/2019/extlst" xmlns:r="http://schemas.openxmlformats.org/officeDocument/2006/relationships" xmlns:m="http://schemas.openxmlformats.org/officeDocument/2006/math" xmlns:v="urn:schemas-microsoft-com:vml" xmlns:wp14="http://schemas.microsoft.com/office/word/2010/wordprocessingDrawing" xmlns:wp="http://schemas.openxmlformats.org/drawingml/2006/wordprocessingDrawing" xmlns:w10="urn:schemas-microsoft-com:office:word" xmlns:w="http://schemas.openxmlformats.org/wordprocessingml/2006/main" xmlns:w14="http://schemas.microsoft.com/office/word/2010/wordml" xmlns:w15="http://schemas.microsoft.com/office/word/2012/wordml" xmlns:w16cex="http://schemas.microsoft.com/office/word/2018/wordml/cex" xmlns:w16cid="http://schemas.microsoft.com/office/word/2016/wordml/cid" xmlns:w16="http://schemas.microsoft.com/office/word/2018/wordml" xmlns:w16du="http://schemas.microsoft.com/office/word/2023/wordml/word16du" xmlns:w16sdtdh="http://schemas.microsoft.com/office/word/2020/wordml/sdtdatahash" xmlns:w16sdtfl="http://schemas.microsoft.com/office/word/2024/wordml/sdtformatlock" xmlns:w16se="http://schemas.microsoft.com/office/word/2015/wordml/symex" xmlns:wpg="http://schemas.microsoft.com/office/word/2010/wordprocessingGroup" xmlns:wpi="http://schemas.microsoft.com/office/word/2010/wordprocessingInk" xmlns:wne="http://schemas.microsoft.com/office/word/2006/wordml" xmlns:wps="http://schemas.microsoft.com/office/word/2010/wordprocessingShape" mc:Ignorable="w14 w15 w16se w16cid w16 w16cex w16sdtdh w16sdtfl w16du wp14">
+<w:footnotes xmlns:wpc="http://schemas.microsoft.com/office/word/2010/wordprocessingCanvas" xmlns:cx="http://schemas.microsoft.com/office/drawing/2014/chartex" xmlns:cx1="http://schemas.microsoft.com/office/drawing/2015/9/8/chartex" xmlns:cx2="http://schemas.microsoft.com/office/drawing/2015/10/21/chartex" xmlns:cx3="http://schemas.microsoft.com/office/drawing/2016/5/9/chartex" xmlns:cx4="http://schemas.microsoft.com/office/drawing/2016/5/10/chartex" xmlns:cx5="http://schemas.microsoft.com/office/drawing/2016/5/11/chartex" xmlns:cx6="http://schemas.microsoft.com/office/drawing/2016/5/12/chartex" xmlns:cx7="http://schemas.microsoft.com/office/drawing/2016/5/13/chartex" xmlns:cx8="http://schemas.microsoft.com/office/drawing/2016/5/14/chartex" xmlns:mc="http://schemas.openxmlformats.org/markup-compatibility/2006" xmlns:aink="http://schemas.microsoft.com/office/drawing/2016/ink" xmlns:am3d="http://schemas.microsoft.com/office/drawing/2017/model3d" xmlns:o="urn:schemas-microsoft-com:office:office" xmlns:oel="http://schemas.microsoft.com/office/2019/extlst" xmlns:r="http://schemas.openxmlformats.org/officeDocument/2006/relationships" xmlns:m="http://schemas.openxmlformats.org/officeDocument/2006/math" xmlns:v="urn:schemas-microsoft-com:vml" xmlns:wp14="http://schemas.microsoft.com/office/word/2010/wordprocessingDrawing" xmlns:wp="http://schemas.openxmlformats.org/drawingml/2006/wordprocessingDrawing" xmlns:w10="urn:schemas-microsoft-com:office:word" xmlns:w="http://schemas.openxmlformats.org/wordprocessingml/2006/main" xmlns:w14="http://schemas.microsoft.com/office/word/2010/wordml" xmlns:w15="http://schemas.microsoft.com/office/word/2012/wordml" xmlns:w16cei="http://schemas.microsoft.com/office/word/2026/wordml/cei" xmlns:w16cex="http://schemas.microsoft.com/office/word/2018/wordml/cex" xmlns:w16cid="http://schemas.microsoft.com/office/word/2016/wordml/cid" xmlns:w16="http://schemas.microsoft.com/office/word/2018/wordml" xmlns:w16du="http://schemas.microsoft.com/office/word/2023/wordml/word16du" xmlns:w16sdtdh="http://schemas.microsoft.com/office/word/2020/wordml/sdtdatahash" xmlns:w16sdtfl="http://schemas.microsoft.com/office/word/2024/wordml/sdtformatlock" xmlns:w16se="http://schemas.microsoft.com/office/word/2015/wordml/symex" xmlns:wpg="http://schemas.microsoft.com/office/word/2010/wordprocessingGroup" xmlns:wpi="http://schemas.microsoft.com/office/word/2010/wordprocessingInk" xmlns:wne="http://schemas.microsoft.com/office/word/2006/wordml" xmlns:wps="http://schemas.microsoft.com/office/word/2010/wordprocessingShape" mc:Ignorable="w14 w15 w16se w16cid w16 w16cex w16sdtdh w16sdtfl w16du wp14">
   <w:footnote w:type="separator" w:id="-1">
     <w:p>
       <w:pPr>
@@ -4668,7 +4689,7 @@
 </file>
 
 <file path=word/header1.xml><?xml version="1.0" encoding="utf-8"?>
-<w:hdr xmlns:wpc="http://schemas.microsoft.com/office/word/2010/wordprocessingCanvas" xmlns:cx="http://schemas.microsoft.com/office/drawing/2014/chartex" xmlns:cx1="http://schemas.microsoft.com/office/drawing/2015/9/8/chartex" xmlns:cx2="http://schemas.microsoft.com/office/drawing/2015/10/21/chartex" xmlns:cx3="http://schemas.microsoft.com/office/drawing/2016/5/9/chartex" xmlns:cx4="http://schemas.microsoft.com/office/drawing/2016/5/10/chartex" xmlns:cx5="http://schemas.microsoft.com/office/drawing/2016/5/11/chartex" xmlns:cx6="http://schemas.microsoft.com/office/drawing/2016/5/12/chartex" xmlns:cx7="http://schemas.microsoft.com/office/drawing/2016/5/13/chartex" xmlns:cx8="http://schemas.microsoft.com/office/drawing/2016/5/14/chartex" xmlns:mc="http://schemas.openxmlformats.org/markup-compatibility/2006" xmlns:aink="http://schemas.microsoft.com/office/drawing/2016/ink" xmlns:am3d="http://schemas.microsoft.com/office/drawing/2017/model3d" xmlns:o="urn:schemas-microsoft-com:office:office" xmlns:oel="http://schemas.microsoft.com/office/2019/extlst" xmlns:r="http://schemas.openxmlformats.org/officeDocument/2006/relationships" xmlns:m="http://schemas.openxmlformats.org/officeDocument/2006/math" xmlns:v="urn:schemas-microsoft-com:vml" xmlns:wp14="http://schemas.microsoft.com/office/word/2010/wordprocessingDrawing" xmlns:wp="http://schemas.openxmlformats.org/drawingml/2006/wordprocessingDrawing" xmlns:w10="urn:schemas-microsoft-com:office:word" xmlns:w="http://schemas.openxmlformats.org/wordprocessingml/2006/main" xmlns:w14="http://schemas.microsoft.com/office/word/2010/wordml" xmlns:w15="http://schemas.microsoft.com/office/word/2012/wordml" xmlns:w16cex="http://schemas.microsoft.com/office/word/2018/wordml/cex" xmlns:w16cid="http://schemas.microsoft.com/office/word/2016/wordml/cid" xmlns:w16="http://schemas.microsoft.com/office/word/2018/wordml" xmlns:w16du="http://schemas.microsoft.com/office/word/2023/wordml/word16du" xmlns:w16sdtdh="http://schemas.microsoft.com/office/word/2020/wordml/sdtdatahash" xmlns:w16sdtfl="http://schemas.microsoft.com/office/word/2024/wordml/sdtformatlock" xmlns:w16se="http://schemas.microsoft.com/office/word/2015/wordml/symex" xmlns:wpg="http://schemas.microsoft.com/office/word/2010/wordprocessingGroup" xmlns:wpi="http://schemas.microsoft.com/office/word/2010/wordprocessingInk" xmlns:wne="http://schemas.microsoft.com/office/word/2006/wordml" xmlns:wps="http://schemas.microsoft.com/office/word/2010/wordprocessingShape" mc:Ignorable="w14 w15 w16se w16cid w16 w16cex w16sdtdh w16sdtfl w16du wp14">
+<w:hdr xmlns:wpc="http://schemas.microsoft.com/office/word/2010/wordprocessingCanvas" xmlns:cx="http://schemas.microsoft.com/office/drawing/2014/chartex" xmlns:cx1="http://schemas.microsoft.com/office/drawing/2015/9/8/chartex" xmlns:cx2="http://schemas.microsoft.com/office/drawing/2015/10/21/chartex" xmlns:cx3="http://schemas.microsoft.com/office/drawing/2016/5/9/chartex" xmlns:cx4="http://schemas.microsoft.com/office/drawing/2016/5/10/chartex" xmlns:cx5="http://schemas.microsoft.com/office/drawing/2016/5/11/chartex" xmlns:cx6="http://schemas.microsoft.com/office/drawing/2016/5/12/chartex" xmlns:cx7="http://schemas.microsoft.com/office/drawing/2016/5/13/chartex" xmlns:cx8="http://schemas.microsoft.com/office/drawing/2016/5/14/chartex" xmlns:mc="http://schemas.openxmlformats.org/markup-compatibility/2006" xmlns:aink="http://schemas.microsoft.com/office/drawing/2016/ink" xmlns:am3d="http://schemas.microsoft.com/office/drawing/2017/model3d" xmlns:o="urn:schemas-microsoft-com:office:office" xmlns:oel="http://schemas.microsoft.com/office/2019/extlst" xmlns:r="http://schemas.openxmlformats.org/officeDocument/2006/relationships" xmlns:m="http://schemas.openxmlformats.org/officeDocument/2006/math" xmlns:v="urn:schemas-microsoft-com:vml" xmlns:wp14="http://schemas.microsoft.com/office/word/2010/wordprocessingDrawing" xmlns:wp="http://schemas.openxmlformats.org/drawingml/2006/wordprocessingDrawing" xmlns:w10="urn:schemas-microsoft-com:office:word" xmlns:w="http://schemas.openxmlformats.org/wordprocessingml/2006/main" xmlns:w14="http://schemas.microsoft.com/office/word/2010/wordml" xmlns:w15="http://schemas.microsoft.com/office/word/2012/wordml" xmlns:w16cei="http://schemas.microsoft.com/office/word/2026/wordml/cei" xmlns:w16cex="http://schemas.microsoft.com/office/word/2018/wordml/cex" xmlns:w16cid="http://schemas.microsoft.com/office/word/2016/wordml/cid" xmlns:w16="http://schemas.microsoft.com/office/word/2018/wordml" xmlns:w16du="http://schemas.microsoft.com/office/word/2023/wordml/word16du" xmlns:w16sdtdh="http://schemas.microsoft.com/office/word/2020/wordml/sdtdatahash" xmlns:w16sdtfl="http://schemas.microsoft.com/office/word/2024/wordml/sdtformatlock" xmlns:w16se="http://schemas.microsoft.com/office/word/2015/wordml/symex" xmlns:wpg="http://schemas.microsoft.com/office/word/2010/wordprocessingGroup" xmlns:wpi="http://schemas.microsoft.com/office/word/2010/wordprocessingInk" xmlns:wne="http://schemas.microsoft.com/office/word/2006/wordml" xmlns:wps="http://schemas.microsoft.com/office/word/2010/wordprocessingShape" mc:Ignorable="w14 w15 w16se w16cid w16 w16cex w16sdtdh w16sdtfl w16du wp14">
   <w:p>
     <w:pPr>
       <w:spacing w:after="0" w:line="240" w:lineRule="auto"/>
@@ -4702,7 +4723,7 @@
         <w:sz w:val="16"/>
         <w:szCs w:val="16"/>
       </w:rPr>
-      <w:t>1.0</w:t>
+      <w:t>1.</w:t>
     </w:r>
     <w:r>
       <w:rPr>
@@ -4713,7 +4734,7 @@
         <w:sz w:val="16"/>
         <w:szCs w:val="16"/>
       </w:rPr>
-      <w:t xml:space="preserve"> | </w:t>
+      <w:t>1</w:t>
     </w:r>
     <w:r>
       <w:rPr>
@@ -4724,40 +4745,7 @@
         <w:sz w:val="16"/>
         <w:szCs w:val="16"/>
       </w:rPr>
-      <w:t>November</w:t>
-    </w:r>
-    <w:r>
-      <w:rPr>
-        <w:rFonts w:ascii="Calibri" w:eastAsia="Calibri" w:hAnsi="Calibri" w:cs="Calibri"/>
-        <w:b/>
-        <w:bCs/>
-        <w:color w:val="646464"/>
-        <w:sz w:val="16"/>
-        <w:szCs w:val="16"/>
-      </w:rPr>
-      <w:t xml:space="preserve"> 202</w:t>
-    </w:r>
-    <w:r>
-      <w:rPr>
-        <w:rFonts w:ascii="Calibri" w:eastAsia="Calibri" w:hAnsi="Calibri" w:cs="Calibri"/>
-        <w:b/>
-        <w:bCs/>
-        <w:color w:val="646464"/>
-        <w:sz w:val="16"/>
-        <w:szCs w:val="16"/>
-      </w:rPr>
-      <w:t>3</w:t>
-    </w:r>
-    <w:r>
-      <w:rPr>
-        <w:rFonts w:ascii="Calibri" w:eastAsia="Calibri" w:hAnsi="Calibri" w:cs="Calibri"/>
-        <w:b/>
-        <w:bCs/>
-        <w:color w:val="646464"/>
-        <w:sz w:val="16"/>
-        <w:szCs w:val="16"/>
-      </w:rPr>
-      <w:t xml:space="preserve">                                                                                                                                               </w:t>
+      <w:t xml:space="preserve"> | </w:t>
     </w:r>
     <w:r>
       <w:rPr>
@@ -4841,6 +4829,17 @@
         </wp:anchor>
       </w:drawing>
     </w:r>
+    <w:r>
+      <w:rPr>
+        <w:rFonts w:ascii="Calibri" w:eastAsia="Calibri" w:hAnsi="Calibri" w:cs="Calibri"/>
+        <w:b/>
+        <w:bCs/>
+        <w:color w:val="646464"/>
+        <w:sz w:val="16"/>
+        <w:szCs w:val="16"/>
+      </w:rPr>
+      <w:t>August 2026</w:t>
+    </w:r>
   </w:p>
   <w:p>
     <w:pPr>
@@ -4946,7 +4945,7 @@
 </file>
 
 <file path=word/numbering.xml><?xml version="1.0" encoding="utf-8"?>
-<w:numbering xmlns:wpc="http://schemas.microsoft.com/office/word/2010/wordprocessingCanvas" xmlns:cx="http://schemas.microsoft.com/office/drawing/2014/chartex" xmlns:cx1="http://schemas.microsoft.com/office/drawing/2015/9/8/chartex" xmlns:cx2="http://schemas.microsoft.com/office/drawing/2015/10/21/chartex" xmlns:cx3="http://schemas.microsoft.com/office/drawing/2016/5/9/chartex" xmlns:cx4="http://schemas.microsoft.com/office/drawing/2016/5/10/chartex" xmlns:cx5="http://schemas.microsoft.com/office/drawing/2016/5/11/chartex" xmlns:cx6="http://schemas.microsoft.com/office/drawing/2016/5/12/chartex" xmlns:cx7="http://schemas.microsoft.com/office/drawing/2016/5/13/chartex" xmlns:cx8="http://schemas.microsoft.com/office/drawing/2016/5/14/chartex" xmlns:mc="http://schemas.openxmlformats.org/markup-compatibility/2006" xmlns:aink="http://schemas.microsoft.com/office/drawing/2016/ink" xmlns:am3d="http://schemas.microsoft.com/office/drawing/2017/model3d" xmlns:o="urn:schemas-microsoft-com:office:office" xmlns:oel="http://schemas.microsoft.com/office/2019/extlst" xmlns:r="http://schemas.openxmlformats.org/officeDocument/2006/relationships" xmlns:m="http://schemas.openxmlformats.org/officeDocument/2006/math" xmlns:v="urn:schemas-microsoft-com:vml" xmlns:wp14="http://schemas.microsoft.com/office/word/2010/wordprocessingDrawing" xmlns:wp="http://schemas.openxmlformats.org/drawingml/2006/wordprocessingDrawing" xmlns:w10="urn:schemas-microsoft-com:office:word" xmlns:w="http://schemas.openxmlformats.org/wordprocessingml/2006/main" xmlns:w14="http://schemas.microsoft.com/office/word/2010/wordml" xmlns:w15="http://schemas.microsoft.com/office/word/2012/wordml" xmlns:w16cex="http://schemas.microsoft.com/office/word/2018/wordml/cex" xmlns:w16cid="http://schemas.microsoft.com/office/word/2016/wordml/cid" xmlns:w16="http://schemas.microsoft.com/office/word/2018/wordml" xmlns:w16du="http://schemas.microsoft.com/office/word/2023/wordml/word16du" xmlns:w16sdtdh="http://schemas.microsoft.com/office/word/2020/wordml/sdtdatahash" xmlns:w16sdtfl="http://schemas.microsoft.com/office/word/2024/wordml/sdtformatlock" xmlns:w16se="http://schemas.microsoft.com/office/word/2015/wordml/symex" xmlns:wpg="http://schemas.microsoft.com/office/word/2010/wordprocessingGroup" xmlns:wpi="http://schemas.microsoft.com/office/word/2010/wordprocessingInk" xmlns:wne="http://schemas.microsoft.com/office/word/2006/wordml" xmlns:wps="http://schemas.microsoft.com/office/word/2010/wordprocessingShape" mc:Ignorable="w14 w15 w16se w16cid w16 w16cex w16sdtdh w16sdtfl w16du wp14">
+<w:numbering xmlns:wpc="http://schemas.microsoft.com/office/word/2010/wordprocessingCanvas" xmlns:cx="http://schemas.microsoft.com/office/drawing/2014/chartex" xmlns:cx1="http://schemas.microsoft.com/office/drawing/2015/9/8/chartex" xmlns:cx2="http://schemas.microsoft.com/office/drawing/2015/10/21/chartex" xmlns:cx3="http://schemas.microsoft.com/office/drawing/2016/5/9/chartex" xmlns:cx4="http://schemas.microsoft.com/office/drawing/2016/5/10/chartex" xmlns:cx5="http://schemas.microsoft.com/office/drawing/2016/5/11/chartex" xmlns:cx6="http://schemas.microsoft.com/office/drawing/2016/5/12/chartex" xmlns:cx7="http://schemas.microsoft.com/office/drawing/2016/5/13/chartex" xmlns:cx8="http://schemas.microsoft.com/office/drawing/2016/5/14/chartex" xmlns:mc="http://schemas.openxmlformats.org/markup-compatibility/2006" xmlns:aink="http://schemas.microsoft.com/office/drawing/2016/ink" xmlns:am3d="http://schemas.microsoft.com/office/drawing/2017/model3d" xmlns:o="urn:schemas-microsoft-com:office:office" xmlns:oel="http://schemas.microsoft.com/office/2019/extlst" xmlns:r="http://schemas.openxmlformats.org/officeDocument/2006/relationships" xmlns:m="http://schemas.openxmlformats.org/officeDocument/2006/math" xmlns:v="urn:schemas-microsoft-com:vml" xmlns:wp14="http://schemas.microsoft.com/office/word/2010/wordprocessingDrawing" xmlns:wp="http://schemas.openxmlformats.org/drawingml/2006/wordprocessingDrawing" xmlns:w10="urn:schemas-microsoft-com:office:word" xmlns:w="http://schemas.openxmlformats.org/wordprocessingml/2006/main" xmlns:w14="http://schemas.microsoft.com/office/word/2010/wordml" xmlns:w15="http://schemas.microsoft.com/office/word/2012/wordml" xmlns:w16cei="http://schemas.microsoft.com/office/word/2026/wordml/cei" xmlns:w16cex="http://schemas.microsoft.com/office/word/2018/wordml/cex" xmlns:w16cid="http://schemas.microsoft.com/office/word/2016/wordml/cid" xmlns:w16="http://schemas.microsoft.com/office/word/2018/wordml" xmlns:w16du="http://schemas.microsoft.com/office/word/2023/wordml/word16du" xmlns:w16sdtdh="http://schemas.microsoft.com/office/word/2020/wordml/sdtdatahash" xmlns:w16sdtfl="http://schemas.microsoft.com/office/word/2024/wordml/sdtformatlock" xmlns:w16se="http://schemas.microsoft.com/office/word/2015/wordml/symex" xmlns:wpg="http://schemas.microsoft.com/office/word/2010/wordprocessingGroup" xmlns:wpi="http://schemas.microsoft.com/office/word/2010/wordprocessingInk" xmlns:wne="http://schemas.microsoft.com/office/word/2006/wordml" xmlns:wps="http://schemas.microsoft.com/office/word/2010/wordprocessingShape" mc:Ignorable="w14 w15 w16se w16cid w16 w16cex w16sdtdh w16sdtfl w16du wp14">
   <w:abstractNum w:abstractNumId="0" w15:restartNumberingAfterBreak="0">
     <w:nsid w:val="21F43906"/>
     <w:multiLevelType w:val="hybridMultilevel"/>
@@ -5154,7 +5153,7 @@
       <w:lvlText w:val="-"/>
       <w:lvlJc w:val="left"/>
       <w:pPr>
-        <w:ind w:left="720" w:hanging="360"/>
+        <w:ind w:left="360" w:hanging="360"/>
       </w:pPr>
       <w:rPr>
         <w:rFonts w:ascii="Calibri" w:eastAsiaTheme="minorHAnsi" w:hAnsi="Calibri" w:cs="Calibri" w:hint="default"/>
@@ -5166,7 +5165,7 @@
       <w:lvlText w:val="o"/>
       <w:lvlJc w:val="left"/>
       <w:pPr>
-        <w:ind w:left="1440" w:hanging="360"/>
+        <w:ind w:left="1080" w:hanging="360"/>
       </w:pPr>
       <w:rPr>
         <w:rFonts w:ascii="Courier New" w:hAnsi="Courier New" w:cs="Courier New" w:hint="default"/>
@@ -5178,7 +5177,7 @@
       <w:lvlText w:val=""/>
       <w:lvlJc w:val="left"/>
       <w:pPr>
-        <w:ind w:left="2160" w:hanging="360"/>
+        <w:ind w:left="1800" w:hanging="360"/>
       </w:pPr>
       <w:rPr>
         <w:rFonts w:ascii="Wingdings" w:hAnsi="Wingdings" w:hint="default"/>
@@ -5190,7 +5189,7 @@
       <w:lvlText w:val=""/>
       <w:lvlJc w:val="left"/>
       <w:pPr>
-        <w:ind w:left="2880" w:hanging="360"/>
+        <w:ind w:left="2520" w:hanging="360"/>
       </w:pPr>
       <w:rPr>
         <w:rFonts w:ascii="Symbol" w:hAnsi="Symbol" w:hint="default"/>
@@ -5202,7 +5201,7 @@
       <w:lvlText w:val="o"/>
       <w:lvlJc w:val="left"/>
       <w:pPr>
-        <w:ind w:left="3600" w:hanging="360"/>
+        <w:ind w:left="3240" w:hanging="360"/>
       </w:pPr>
       <w:rPr>
         <w:rFonts w:ascii="Courier New" w:hAnsi="Courier New" w:cs="Courier New" w:hint="default"/>
@@ -5214,7 +5213,7 @@
       <w:lvlText w:val=""/>
       <w:lvlJc w:val="left"/>
       <w:pPr>
-        <w:ind w:left="4320" w:hanging="360"/>
+        <w:ind w:left="3960" w:hanging="360"/>
       </w:pPr>
       <w:rPr>
         <w:rFonts w:ascii="Wingdings" w:hAnsi="Wingdings" w:hint="default"/>
@@ -5226,7 +5225,7 @@
       <w:lvlText w:val=""/>
       <w:lvlJc w:val="left"/>
       <w:pPr>
-        <w:ind w:left="5040" w:hanging="360"/>
+        <w:ind w:left="4680" w:hanging="360"/>
       </w:pPr>
       <w:rPr>
         <w:rFonts w:ascii="Symbol" w:hAnsi="Symbol" w:hint="default"/>
@@ -5238,7 +5237,7 @@
       <w:lvlText w:val="o"/>
       <w:lvlJc w:val="left"/>
       <w:pPr>
-        <w:ind w:left="5760" w:hanging="360"/>
+        <w:ind w:left="5400" w:hanging="360"/>
       </w:pPr>
       <w:rPr>
         <w:rFonts w:ascii="Courier New" w:hAnsi="Courier New" w:cs="Courier New" w:hint="default"/>
@@ -5250,7 +5249,7 @@
       <w:lvlText w:val=""/>
       <w:lvlJc w:val="left"/>
       <w:pPr>
-        <w:ind w:left="6480" w:hanging="360"/>
+        <w:ind w:left="6120" w:hanging="360"/>
       </w:pPr>
       <w:rPr>
         <w:rFonts w:ascii="Wingdings" w:hAnsi="Wingdings" w:hint="default"/>
@@ -5525,7 +5524,7 @@
       <w:lvlText w:val="%1."/>
       <w:lvlJc w:val="left"/>
       <w:pPr>
-        <w:ind w:left="720" w:hanging="360"/>
+        <w:ind w:left="360" w:hanging="360"/>
       </w:pPr>
     </w:lvl>
     <w:lvl w:ilvl="1" w:tplc="10090019" w:tentative="1">
@@ -5534,7 +5533,7 @@
       <w:lvlText w:val="%2."/>
       <w:lvlJc w:val="left"/>
       <w:pPr>
-        <w:ind w:left="1440" w:hanging="360"/>
+        <w:ind w:left="1080" w:hanging="360"/>
       </w:pPr>
     </w:lvl>
     <w:lvl w:ilvl="2" w:tplc="1009001B" w:tentative="1">
@@ -5543,7 +5542,7 @@
       <w:lvlText w:val="%3."/>
       <w:lvlJc w:val="right"/>
       <w:pPr>
-        <w:ind w:left="2160" w:hanging="180"/>
+        <w:ind w:left="1800" w:hanging="180"/>
       </w:pPr>
     </w:lvl>
     <w:lvl w:ilvl="3" w:tplc="1009000F" w:tentative="1">
@@ -5552,7 +5551,7 @@
       <w:lvlText w:val="%4."/>
       <w:lvlJc w:val="left"/>
       <w:pPr>
-        <w:ind w:left="2880" w:hanging="360"/>
+        <w:ind w:left="2520" w:hanging="360"/>
       </w:pPr>
     </w:lvl>
     <w:lvl w:ilvl="4" w:tplc="10090019" w:tentative="1">
@@ -5561,7 +5560,7 @@
       <w:lvlText w:val="%5."/>
       <w:lvlJc w:val="left"/>
       <w:pPr>
-        <w:ind w:left="3600" w:hanging="360"/>
+        <w:ind w:left="3240" w:hanging="360"/>
       </w:pPr>
     </w:lvl>
     <w:lvl w:ilvl="5" w:tplc="1009001B" w:tentative="1">
@@ -5570,7 +5569,7 @@
       <w:lvlText w:val="%6."/>
       <w:lvlJc w:val="right"/>
       <w:pPr>
-        <w:ind w:left="4320" w:hanging="180"/>
+        <w:ind w:left="3960" w:hanging="180"/>
       </w:pPr>
     </w:lvl>
     <w:lvl w:ilvl="6" w:tplc="1009000F" w:tentative="1">
@@ -5579,7 +5578,7 @@
       <w:lvlText w:val="%7."/>
       <w:lvlJc w:val="left"/>
       <w:pPr>
-        <w:ind w:left="5040" w:hanging="360"/>
+        <w:ind w:left="4680" w:hanging="360"/>
       </w:pPr>
     </w:lvl>
     <w:lvl w:ilvl="7" w:tplc="10090019" w:tentative="1">
@@ -5588,7 +5587,7 @@
       <w:lvlText w:val="%8."/>
       <w:lvlJc w:val="left"/>
       <w:pPr>
-        <w:ind w:left="5760" w:hanging="360"/>
+        <w:ind w:left="5400" w:hanging="360"/>
       </w:pPr>
     </w:lvl>
     <w:lvl w:ilvl="8" w:tplc="1009001B" w:tentative="1">
@@ -5597,7 +5596,7 @@
       <w:lvlText w:val="%9."/>
       <w:lvlJc w:val="right"/>
       <w:pPr>
-        <w:ind w:left="6480" w:hanging="180"/>
+        <w:ind w:left="6120" w:hanging="180"/>
       </w:pPr>
     </w:lvl>
   </w:abstractNum>
@@ -7078,6 +7077,18 @@
       <w:u w:val="single"/>
     </w:rPr>
   </w:style>
+  <w:style w:type="character" w:styleId="UnresolvedMention">
+    <w:name w:val="Unresolved Mention"/>
+    <w:basedOn w:val="DefaultParagraphFont"/>
+    <w:uiPriority w:val="99"/>
+    <w:semiHidden/>
+    <w:unhideWhenUsed/>
+    <w:rsid w:val="00F005D5"/>
+    <w:rPr>
+      <w:color w:val="605E5C"/>
+      <w:shd w:val="clear" w:color="auto" w:fill="E1DFDD"/>
+    </w:rPr>
+  </w:style>
 </w:styles>
 </file>
 
@@ -7343,15 +7354,6 @@
 </file>
 
 <file path=customXml/item1.xml><?xml version="1.0" encoding="utf-8"?>
-<?mso-contentType ?>
-<FormTemplates xmlns="http://schemas.microsoft.com/sharepoint/v3/contenttype/forms">
-  <Display>DocumentLibraryForm</Display>
-  <Edit>DocumentLibraryForm</Edit>
-  <New>DocumentLibraryForm</New>
-</FormTemplates>
-</file>
-
-<file path=customXml/item2.xml><?xml version="1.0" encoding="utf-8"?>
 <p:properties xmlns:p="http://schemas.microsoft.com/office/2006/metadata/properties" xmlns:xsi="http://www.w3.org/2001/XMLSchema-instance" xmlns:pc="http://schemas.microsoft.com/office/infopath/2007/PartnerControls">
   <documentManagement>
     <TaxCatchAll xmlns="38b325e6-602c-452a-8617-173bf47082c5" xsi:nil="true"/>
@@ -7362,11 +7364,16 @@
 </p:properties>
 </file>
 
-<file path=customXml/item3.xml><?xml version="1.0" encoding="utf-8"?>
-<b:Sources xmlns:b="http://schemas.openxmlformats.org/officeDocument/2006/bibliography" xmlns="http://schemas.openxmlformats.org/officeDocument/2006/bibliography" SelectedStyle="\APASixthEditionOfficeOnline.xsl" StyleName="APA" Version="6"/>
+<file path=customXml/item2.xml><?xml version="1.0" encoding="utf-8"?>
+<?mso-contentType ?>
+<FormTemplates xmlns="http://schemas.microsoft.com/sharepoint/v3/contenttype/forms">
+  <Display>DocumentLibraryForm</Display>
+  <Edit>DocumentLibraryForm</Edit>
+  <New>DocumentLibraryForm</New>
+</FormTemplates>
 </file>
 
-<file path=customXml/item4.xml><?xml version="1.0" encoding="utf-8"?>
+<file path=customXml/item3.xml><?xml version="1.0" encoding="utf-8"?>
 <ct:contentTypeSchema xmlns:ct="http://schemas.microsoft.com/office/2006/metadata/contentType" xmlns:ma="http://schemas.microsoft.com/office/2006/metadata/properties/metaAttributes" ct:_="" ma:_="" ma:contentTypeName="Document" ma:contentTypeID="0x010100456CAEA290209545A9F8681F83603874" ma:contentTypeVersion="19" ma:contentTypeDescription="Create a new document." ma:contentTypeScope="" ma:versionID="4bf10bb897fc0ef406baa02b9d664253">
   <xsd:schema xmlns:xsd="http://www.w3.org/2001/XMLSchema" xmlns:xs="http://www.w3.org/2001/XMLSchema" xmlns:p="http://schemas.microsoft.com/office/2006/metadata/properties" xmlns:ns2="8cf100d1-0775-4feb-8634-62999c4541bc" xmlns:ns3="38b325e6-602c-452a-8617-173bf47082c5" targetNamespace="http://schemas.microsoft.com/office/2006/metadata/properties" ma:root="true" ma:fieldsID="1c6be4edf2b996d6a6f54fa7c1dd8d7b" ns2:_="" ns3:_="">
     <xsd:import namespace="8cf100d1-0775-4feb-8634-62999c4541bc"/>
@@ -7621,15 +7628,11 @@
 </ct:contentTypeSchema>
 </file>
 
-<file path=customXml/itemProps1.xml><?xml version="1.0" encoding="utf-8"?>
-<ds:datastoreItem xmlns:ds="http://schemas.openxmlformats.org/officeDocument/2006/customXml" ds:itemID="{2585761D-1AE9-4796-83E7-A2FC381967AF}">
-  <ds:schemaRefs>
-    <ds:schemaRef ds:uri="http://schemas.microsoft.com/sharepoint/v3/contenttype/forms"/>
-  </ds:schemaRefs>
-</ds:datastoreItem>
+<file path=customXml/item4.xml><?xml version="1.0" encoding="utf-8"?>
+<b:Sources xmlns:b="http://schemas.openxmlformats.org/officeDocument/2006/bibliography" xmlns="http://schemas.openxmlformats.org/officeDocument/2006/bibliography" SelectedStyle="\APASixthEditionOfficeOnline.xsl" StyleName="APA" Version="6"/>
 </file>
 
-<file path=customXml/itemProps2.xml><?xml version="1.0" encoding="utf-8"?>
+<file path=customXml/itemProps1.xml><?xml version="1.0" encoding="utf-8"?>
 <ds:datastoreItem xmlns:ds="http://schemas.openxmlformats.org/officeDocument/2006/customXml" ds:itemID="{3A085C18-819E-4466-9494-DD461C39C2B0}">
   <ds:schemaRefs>
     <ds:schemaRef ds:uri="http://schemas.microsoft.com/office/2006/metadata/properties"/>
@@ -7640,15 +7643,15 @@
 </ds:datastoreItem>
 </file>
 
-<file path=customXml/itemProps3.xml><?xml version="1.0" encoding="utf-8"?>
-<ds:datastoreItem xmlns:ds="http://schemas.openxmlformats.org/officeDocument/2006/customXml" ds:itemID="{C438ADBA-56D5-474C-BF2C-97C24DDF66BD}">
+<file path=customXml/itemProps2.xml><?xml version="1.0" encoding="utf-8"?>
+<ds:datastoreItem xmlns:ds="http://schemas.openxmlformats.org/officeDocument/2006/customXml" ds:itemID="{2585761D-1AE9-4796-83E7-A2FC381967AF}">
   <ds:schemaRefs>
-    <ds:schemaRef ds:uri="http://schemas.openxmlformats.org/officeDocument/2006/bibliography"/>
+    <ds:schemaRef ds:uri="http://schemas.microsoft.com/sharepoint/v3/contenttype/forms"/>
   </ds:schemaRefs>
 </ds:datastoreItem>
 </file>
 
-<file path=customXml/itemProps4.xml><?xml version="1.0" encoding="utf-8"?>
+<file path=customXml/itemProps3.xml><?xml version="1.0" encoding="utf-8"?>
 <ds:datastoreItem xmlns:ds="http://schemas.openxmlformats.org/officeDocument/2006/customXml" ds:itemID="{0E764229-1C2B-4F6A-8196-F33682904C4F}">
   <ds:schemaRefs>
     <ds:schemaRef ds:uri="http://schemas.microsoft.com/office/2006/metadata/contentType"/>
@@ -7665,4 +7668,12 @@
     <ds:schemaRef ds:uri="http://schemas.microsoft.com/internal/obd"/>
   </ds:schemaRefs>
 </ds:datastoreItem>
+</file>
+
+<file path=customXml/itemProps4.xml><?xml version="1.0" encoding="utf-8"?>
+<ds:datastoreItem xmlns:ds="http://schemas.openxmlformats.org/officeDocument/2006/customXml" ds:itemID="{C438ADBA-56D5-474C-BF2C-97C24DDF66BD}">
+  <ds:schemaRefs>
+    <ds:schemaRef ds:uri="http://schemas.openxmlformats.org/officeDocument/2006/bibliography"/>
+  </ds:schemaRefs>
+</ds:datastoreItem>
 </file>
</xml_diff>